<commit_message>
Add all genes back
</commit_message>
<xml_diff>
--- a/SLC6A1 Grant.docx
+++ b/SLC6A1 Grant.docx
@@ -140,7 +140,7 @@
                 <w:sz w:val="20"/>
                 <w:b w:val="true"/>
               </w:rPr>
-              <w:t xml:space="preserve">Escitalopram</w:t>
+              <w:t xml:space="preserve">Acetylcysteine</w:t>
             </w:r>
           </w:p>
         </w:tc>
@@ -190,7 +190,7 @@
                 <w:rFonts w:ascii="Calibri" w:hAnsi="Calibri"/>
                 <w:sz w:val="20"/>
               </w:rPr>
-              <w:t xml:space="preserve">↓ STX1A, ↑ STING1, ↑ TBK1, ↑ IRF3</w:t>
+              <w:t xml:space="preserve">↓ STX1A, ↑ STING1, ↑ SLC6A1, ↑ TBK1, ↓ GABRG2, ↑ SLC12A2, ↑ PRKCB, ↑ RNF34, ↑ CDK5, ↑ PRKCG, ↑ GRK3, ↑ REST, ↑ GRK2, ↑ ARRB2, ↑ KCTD12, ↑ RGS4, ↑ RGS6</w:t>
             </w:r>
           </w:p>
         </w:tc>
@@ -215,7 +215,7 @@
                 <w:rFonts w:ascii="Calibri" w:hAnsi="Calibri"/>
                 <w:sz w:val="20"/>
               </w:rPr>
-              <w:t xml:space="preserve">↑ GAT1</w:t>
+              <w:t xml:space="preserve">↑ GAT1, ↓ GABA B receptor, ↓ GABA A receptor</w:t>
             </w:r>
           </w:p>
         </w:tc>
@@ -246,7 +246,7 @@
                 <w:sz w:val="20"/>
                 <w:b w:val="true"/>
               </w:rPr>
-              <w:t xml:space="preserve">Gabapentin</w:t>
+              <w:t xml:space="preserve">Amitriptyline</w:t>
             </w:r>
           </w:p>
         </w:tc>
@@ -294,31 +294,31 @@
                 <w:rFonts w:ascii="Calibri" w:hAnsi="Calibri"/>
                 <w:sz w:val="20"/>
               </w:rPr>
-              <w:t xml:space="preserve">↑ SLC6A1</w:t>
-            </w:r>
-          </w:p>
-        </w:tc>
-        <w:tc>
-          <w:tcPr>
-            <w:tcBorders>
-              <w:top w:val="single" w:space="0" w:color="D3D3D3"/>
-              <w:bottom w:val="single" w:space="0" w:color="D3D3D3"/>
-              <w:start w:val="single" w:space="0" w:color="D3D3D3"/>
-              <w:end w:val="single" w:space="0" w:color="D3D3D3"/>
-            </w:tcBorders>
-          </w:tcPr>
-          <w:p>
-            <w:pPr>
-              <w:spacing w:before="0" w:after="60"/>
-              <w:keepNext/>
-              <w:jc w:val="center"/>
-            </w:pPr>
-            <w:r>
-              <w:rPr>
-                <w:rFonts w:ascii="Calibri" w:hAnsi="Calibri"/>
-                <w:sz w:val="20"/>
-              </w:rPr>
-              <w:t xml:space="preserve">↑ GAT1</w:t>
+              <w:t xml:space="preserve">↑ STING1, ↑ SLC6A1, ↑ SLC12A2, ↑ PRKCB, ↓ GABBR1, ↑ REST, ↑ RGS4, ↑ RGS6</w:t>
+            </w:r>
+          </w:p>
+        </w:tc>
+        <w:tc>
+          <w:tcPr>
+            <w:tcBorders>
+              <w:top w:val="single" w:space="0" w:color="D3D3D3"/>
+              <w:bottom w:val="single" w:space="0" w:color="D3D3D3"/>
+              <w:start w:val="single" w:space="0" w:color="D3D3D3"/>
+              <w:end w:val="single" w:space="0" w:color="D3D3D3"/>
+            </w:tcBorders>
+          </w:tcPr>
+          <w:p>
+            <w:pPr>
+              <w:spacing w:before="0" w:after="60"/>
+              <w:keepNext/>
+              <w:jc w:val="center"/>
+            </w:pPr>
+            <w:r>
+              <w:rPr>
+                <w:rFonts w:ascii="Calibri" w:hAnsi="Calibri"/>
+                <w:sz w:val="20"/>
+              </w:rPr>
+              <w:t xml:space="preserve">↑ GAT1, ↓ GABA B receptor, ↓ GABA A receptor</w:t>
             </w:r>
           </w:p>
         </w:tc>
@@ -349,7 +349,7 @@
                 <w:sz w:val="20"/>
                 <w:b w:val="true"/>
               </w:rPr>
-              <w:t xml:space="preserve">Pyridoxine</w:t>
+              <w:t xml:space="preserve">Budesonide</w:t>
             </w:r>
           </w:p>
         </w:tc>
@@ -399,7 +399,7 @@
                 <w:rFonts w:ascii="Calibri" w:hAnsi="Calibri"/>
                 <w:sz w:val="20"/>
               </w:rPr>
-              <w:t xml:space="preserve">↓ STX1A</w:t>
+              <w:t xml:space="preserve">↓ STX1A, ↑ STING1, ↓ GABRG2, ↑ PRKCB, ↑ GRK2, ↑ ARRB2, ↑ RGS4, ↑ RGS6</w:t>
             </w:r>
           </w:p>
         </w:tc>
@@ -424,7 +424,7 @@
                 <w:rFonts w:ascii="Calibri" w:hAnsi="Calibri"/>
                 <w:sz w:val="20"/>
               </w:rPr>
-              <w:t xml:space="preserve">↑ GAT1</w:t>
+              <w:t xml:space="preserve">↑ GAT1, ↓ GABA B receptor, ↓ GABA A receptor</w:t>
             </w:r>
           </w:p>
         </w:tc>
@@ -455,7 +455,7 @@
                 <w:sz w:val="20"/>
                 <w:b w:val="true"/>
               </w:rPr>
-              <w:t xml:space="preserve">Sertraline</w:t>
+              <w:t xml:space="preserve">Clonidine</w:t>
             </w:r>
           </w:p>
         </w:tc>
@@ -503,31 +503,31 @@
                 <w:rFonts w:ascii="Calibri" w:hAnsi="Calibri"/>
                 <w:sz w:val="20"/>
               </w:rPr>
-              <w:t xml:space="preserve">↑ STING1, ↑ TBK1, ↑ IRF3</w:t>
-            </w:r>
-          </w:p>
-        </w:tc>
-        <w:tc>
-          <w:tcPr>
-            <w:tcBorders>
-              <w:top w:val="single" w:space="0" w:color="D3D3D3"/>
-              <w:bottom w:val="single" w:space="0" w:color="D3D3D3"/>
-              <w:start w:val="single" w:space="0" w:color="D3D3D3"/>
-              <w:end w:val="single" w:space="0" w:color="D3D3D3"/>
-            </w:tcBorders>
-          </w:tcPr>
-          <w:p>
-            <w:pPr>
-              <w:spacing w:before="0" w:after="60"/>
-              <w:keepNext/>
-              <w:jc w:val="center"/>
-            </w:pPr>
-            <w:r>
-              <w:rPr>
-                <w:rFonts w:ascii="Calibri" w:hAnsi="Calibri"/>
-                <w:sz w:val="20"/>
-              </w:rPr>
-              <w:t xml:space="preserve">↑ GAT1</w:t>
+              <w:t xml:space="preserve">↓ STX1A, ↑ SLC6A1, ↑ SLC12A2, ↑ PRKCB, ↑ GRK3, ↑ ARRB2</w:t>
+            </w:r>
+          </w:p>
+        </w:tc>
+        <w:tc>
+          <w:tcPr>
+            <w:tcBorders>
+              <w:top w:val="single" w:space="0" w:color="D3D3D3"/>
+              <w:bottom w:val="single" w:space="0" w:color="D3D3D3"/>
+              <w:start w:val="single" w:space="0" w:color="D3D3D3"/>
+              <w:end w:val="single" w:space="0" w:color="D3D3D3"/>
+            </w:tcBorders>
+          </w:tcPr>
+          <w:p>
+            <w:pPr>
+              <w:spacing w:before="0" w:after="60"/>
+              <w:keepNext/>
+              <w:jc w:val="center"/>
+            </w:pPr>
+            <w:r>
+              <w:rPr>
+                <w:rFonts w:ascii="Calibri" w:hAnsi="Calibri"/>
+                <w:sz w:val="20"/>
+              </w:rPr>
+              <w:t xml:space="preserve">↑ GAT1, ↓ GABA B receptor, ↓ GABA A receptor</w:t>
             </w:r>
           </w:p>
         </w:tc>
@@ -558,7 +558,7 @@
                 <w:sz w:val="20"/>
                 <w:b w:val="true"/>
               </w:rPr>
-              <w:t xml:space="preserve">Clemastine</w:t>
+              <w:t xml:space="preserve">Escitalopram</w:t>
             </w:r>
           </w:p>
         </w:tc>
@@ -583,7 +583,7 @@
                 <w:rFonts w:ascii="Calibri" w:hAnsi="Calibri"/>
                 <w:sz w:val="20"/>
               </w:rPr>
-              <w:t xml:space="preserve">4</w:t>
+              <w:t xml:space="preserve">6</w:t>
             </w:r>
           </w:p>
         </w:tc>
@@ -608,7 +608,7 @@
                 <w:rFonts w:ascii="Calibri" w:hAnsi="Calibri"/>
                 <w:sz w:val="20"/>
               </w:rPr>
-              <w:t xml:space="preserve">↓ STX1A</w:t>
+              <w:t xml:space="preserve">↓ STX1A, ↑ CDK5</w:t>
             </w:r>
           </w:p>
         </w:tc>
@@ -633,7 +633,7 @@
                 <w:rFonts w:ascii="Calibri" w:hAnsi="Calibri"/>
                 <w:sz w:val="20"/>
               </w:rPr>
-              <w:t xml:space="preserve">↑ GAT1</w:t>
+              <w:t xml:space="preserve">↑ GAT1, ↓ GABA A receptor</w:t>
             </w:r>
           </w:p>
         </w:tc>
@@ -664,79 +664,79 @@
                 <w:sz w:val="20"/>
                 <w:b w:val="true"/>
               </w:rPr>
-              <w:t xml:space="preserve">Pregabalin</w:t>
-            </w:r>
-          </w:p>
-        </w:tc>
-        <w:tc>
-          <w:tcPr>
-            <w:tcBorders>
-              <w:top w:val="single" w:space="0" w:color="D3D3D3"/>
-              <w:bottom w:val="single" w:space="0" w:color="D3D3D3"/>
-              <w:start w:val="single" w:space="0" w:color="D3D3D3"/>
-              <w:end w:val="single" w:space="0" w:color="D3D3D3"/>
-            </w:tcBorders>
-          </w:tcPr>
-          <w:p>
-            <w:pPr>
-              <w:spacing w:before="0" w:after="60"/>
-              <w:keepNext/>
-              <w:jc w:val="center"/>
-            </w:pPr>
-            <w:r>
-              <w:rPr>
-                <w:rFonts w:ascii="Calibri" w:hAnsi="Calibri"/>
-                <w:sz w:val="20"/>
-              </w:rPr>
-              <w:t xml:space="preserve">4</w:t>
-            </w:r>
-          </w:p>
-        </w:tc>
-        <w:tc>
-          <w:tcPr>
-            <w:tcBorders>
-              <w:top w:val="single" w:space="0" w:color="D3D3D3"/>
-              <w:bottom w:val="single" w:space="0" w:color="D3D3D3"/>
-              <w:start w:val="single" w:space="0" w:color="D3D3D3"/>
-              <w:end w:val="single" w:space="0" w:color="D3D3D3"/>
-            </w:tcBorders>
-          </w:tcPr>
-          <w:p>
-            <w:pPr>
-              <w:spacing w:before="0" w:after="60"/>
-              <w:keepNext/>
-              <w:jc w:val="center"/>
-            </w:pPr>
-            <w:r>
-              <w:rPr>
-                <w:rFonts w:ascii="Calibri" w:hAnsi="Calibri"/>
-                <w:sz w:val="20"/>
-              </w:rPr>
-              <w:t xml:space="preserve">↑ SLC6A1</w:t>
-            </w:r>
-          </w:p>
-        </w:tc>
-        <w:tc>
-          <w:tcPr>
-            <w:tcBorders>
-              <w:top w:val="single" w:space="0" w:color="D3D3D3"/>
-              <w:bottom w:val="single" w:space="0" w:color="D3D3D3"/>
-              <w:start w:val="single" w:space="0" w:color="D3D3D3"/>
-              <w:end w:val="single" w:space="0" w:color="D3D3D3"/>
-            </w:tcBorders>
-          </w:tcPr>
-          <w:p>
-            <w:pPr>
-              <w:spacing w:before="0" w:after="60"/>
-              <w:keepNext/>
-              <w:jc w:val="center"/>
-            </w:pPr>
-            <w:r>
-              <w:rPr>
-                <w:rFonts w:ascii="Calibri" w:hAnsi="Calibri"/>
-                <w:sz w:val="20"/>
-              </w:rPr>
-              <w:t xml:space="preserve">↑ GAT1</w:t>
+              <w:t xml:space="preserve">Gabapentin</w:t>
+            </w:r>
+          </w:p>
+        </w:tc>
+        <w:tc>
+          <w:tcPr>
+            <w:tcBorders>
+              <w:top w:val="single" w:space="0" w:color="D3D3D3"/>
+              <w:bottom w:val="single" w:space="0" w:color="D3D3D3"/>
+              <w:start w:val="single" w:space="0" w:color="D3D3D3"/>
+              <w:end w:val="single" w:space="0" w:color="D3D3D3"/>
+            </w:tcBorders>
+          </w:tcPr>
+          <w:p>
+            <w:pPr>
+              <w:spacing w:before="0" w:after="60"/>
+              <w:keepNext/>
+              <w:jc w:val="center"/>
+            </w:pPr>
+            <w:r>
+              <w:rPr>
+                <w:rFonts w:ascii="Calibri" w:hAnsi="Calibri"/>
+                <w:sz w:val="20"/>
+              </w:rPr>
+              <w:t xml:space="preserve">6</w:t>
+            </w:r>
+          </w:p>
+        </w:tc>
+        <w:tc>
+          <w:tcPr>
+            <w:tcBorders>
+              <w:top w:val="single" w:space="0" w:color="D3D3D3"/>
+              <w:bottom w:val="single" w:space="0" w:color="D3D3D3"/>
+              <w:start w:val="single" w:space="0" w:color="D3D3D3"/>
+              <w:end w:val="single" w:space="0" w:color="D3D3D3"/>
+            </w:tcBorders>
+          </w:tcPr>
+          <w:p>
+            <w:pPr>
+              <w:spacing w:before="0" w:after="60"/>
+              <w:keepNext/>
+              <w:jc w:val="center"/>
+            </w:pPr>
+            <w:r>
+              <w:rPr>
+                <w:rFonts w:ascii="Calibri" w:hAnsi="Calibri"/>
+                <w:sz w:val="20"/>
+              </w:rPr>
+              <w:t xml:space="preserve">↑ SLC6A1, ↓ GABBR2</w:t>
+            </w:r>
+          </w:p>
+        </w:tc>
+        <w:tc>
+          <w:tcPr>
+            <w:tcBorders>
+              <w:top w:val="single" w:space="0" w:color="D3D3D3"/>
+              <w:bottom w:val="single" w:space="0" w:color="D3D3D3"/>
+              <w:start w:val="single" w:space="0" w:color="D3D3D3"/>
+              <w:end w:val="single" w:space="0" w:color="D3D3D3"/>
+            </w:tcBorders>
+          </w:tcPr>
+          <w:p>
+            <w:pPr>
+              <w:spacing w:before="0" w:after="60"/>
+              <w:keepNext/>
+              <w:jc w:val="center"/>
+            </w:pPr>
+            <w:r>
+              <w:rPr>
+                <w:rFonts w:ascii="Calibri" w:hAnsi="Calibri"/>
+                <w:sz w:val="20"/>
+              </w:rPr>
+              <w:t xml:space="preserve">↑ GAT1, ↓ GABA B receptor</w:t>
             </w:r>
           </w:p>
         </w:tc>
@@ -767,7 +767,7 @@
                 <w:sz w:val="20"/>
                 <w:b w:val="true"/>
               </w:rPr>
-              <w:t xml:space="preserve">Nalbuphine</w:t>
+              <w:t xml:space="preserve">Glutamic acid</w:t>
             </w:r>
           </w:p>
         </w:tc>
@@ -792,7 +792,7 @@
                 <w:rFonts w:ascii="Calibri" w:hAnsi="Calibri"/>
                 <w:sz w:val="20"/>
               </w:rPr>
-              <w:t xml:space="preserve">3</w:t>
+              <w:t xml:space="preserve">6</w:t>
             </w:r>
           </w:p>
         </w:tc>
@@ -817,7 +817,7 @@
                 <w:rFonts w:ascii="Calibri" w:hAnsi="Calibri"/>
                 <w:sz w:val="20"/>
               </w:rPr>
-              <w:t xml:space="preserve">↓ STX1A</w:t>
+              <w:t xml:space="preserve">↑ STING1, ↑ CDK5, ↑ PRKCG, ↑ GRK2, ↑ ARRB2, ↑ RGS6</w:t>
             </w:r>
           </w:p>
         </w:tc>
@@ -842,7 +842,7 @@
                 <w:rFonts w:ascii="Calibri" w:hAnsi="Calibri"/>
                 <w:sz w:val="20"/>
               </w:rPr>
-              <w:t xml:space="preserve">↑ GAT1</w:t>
+              <w:t xml:space="preserve">↑ GAT1, ↓ GABA B receptor, ↓ GABA A receptor</w:t>
             </w:r>
           </w:p>
         </w:tc>
@@ -873,79 +873,79 @@
                 <w:sz w:val="20"/>
                 <w:b w:val="true"/>
               </w:rPr>
-              <w:t xml:space="preserve">Pyridostigmine</w:t>
-            </w:r>
-          </w:p>
-        </w:tc>
-        <w:tc>
-          <w:tcPr>
-            <w:tcBorders>
-              <w:top w:val="single" w:space="0" w:color="D3D3D3"/>
-              <w:bottom w:val="single" w:space="0" w:color="D3D3D3"/>
-              <w:start w:val="single" w:space="0" w:color="D3D3D3"/>
-              <w:end w:val="single" w:space="0" w:color="D3D3D3"/>
-            </w:tcBorders>
-          </w:tcPr>
-          <w:p>
-            <w:pPr>
-              <w:spacing w:before="0" w:after="60"/>
-              <w:keepNext/>
-              <w:jc w:val="center"/>
-            </w:pPr>
-            <w:r>
-              <w:rPr>
-                <w:rFonts w:ascii="Calibri" w:hAnsi="Calibri"/>
-                <w:sz w:val="20"/>
-              </w:rPr>
-              <w:t xml:space="preserve">3</w:t>
-            </w:r>
-          </w:p>
-        </w:tc>
-        <w:tc>
-          <w:tcPr>
-            <w:tcBorders>
-              <w:top w:val="single" w:space="0" w:color="D3D3D3"/>
-              <w:bottom w:val="single" w:space="0" w:color="D3D3D3"/>
-              <w:start w:val="single" w:space="0" w:color="D3D3D3"/>
-              <w:end w:val="single" w:space="0" w:color="D3D3D3"/>
-            </w:tcBorders>
-          </w:tcPr>
-          <w:p>
-            <w:pPr>
-              <w:spacing w:before="0" w:after="60"/>
-              <w:keepNext/>
-              <w:jc w:val="center"/>
-            </w:pPr>
-            <w:r>
-              <w:rPr>
-                <w:rFonts w:ascii="Calibri" w:hAnsi="Calibri"/>
-                <w:sz w:val="20"/>
-              </w:rPr>
-              <w:t xml:space="preserve">↑ STING1, ↑ TBK1, ↑ IRF3</w:t>
-            </w:r>
-          </w:p>
-        </w:tc>
-        <w:tc>
-          <w:tcPr>
-            <w:tcBorders>
-              <w:top w:val="single" w:space="0" w:color="D3D3D3"/>
-              <w:bottom w:val="single" w:space="0" w:color="D3D3D3"/>
-              <w:start w:val="single" w:space="0" w:color="D3D3D3"/>
-              <w:end w:val="single" w:space="0" w:color="D3D3D3"/>
-            </w:tcBorders>
-          </w:tcPr>
-          <w:p>
-            <w:pPr>
-              <w:spacing w:before="0" w:after="60"/>
-              <w:keepNext/>
-              <w:jc w:val="center"/>
-            </w:pPr>
-            <w:r>
-              <w:rPr>
-                <w:rFonts w:ascii="Calibri" w:hAnsi="Calibri"/>
-                <w:sz w:val="20"/>
-              </w:rPr>
-              <w:t xml:space="preserve">↑ GAT1</w:t>
+              <w:t xml:space="preserve">Lovastatin</w:t>
+            </w:r>
+          </w:p>
+        </w:tc>
+        <w:tc>
+          <w:tcPr>
+            <w:tcBorders>
+              <w:top w:val="single" w:space="0" w:color="D3D3D3"/>
+              <w:bottom w:val="single" w:space="0" w:color="D3D3D3"/>
+              <w:start w:val="single" w:space="0" w:color="D3D3D3"/>
+              <w:end w:val="single" w:space="0" w:color="D3D3D3"/>
+            </w:tcBorders>
+          </w:tcPr>
+          <w:p>
+            <w:pPr>
+              <w:spacing w:before="0" w:after="60"/>
+              <w:keepNext/>
+              <w:jc w:val="center"/>
+            </w:pPr>
+            <w:r>
+              <w:rPr>
+                <w:rFonts w:ascii="Calibri" w:hAnsi="Calibri"/>
+                <w:sz w:val="20"/>
+              </w:rPr>
+              <w:t xml:space="preserve">6</w:t>
+            </w:r>
+          </w:p>
+        </w:tc>
+        <w:tc>
+          <w:tcPr>
+            <w:tcBorders>
+              <w:top w:val="single" w:space="0" w:color="D3D3D3"/>
+              <w:bottom w:val="single" w:space="0" w:color="D3D3D3"/>
+              <w:start w:val="single" w:space="0" w:color="D3D3D3"/>
+              <w:end w:val="single" w:space="0" w:color="D3D3D3"/>
+            </w:tcBorders>
+          </w:tcPr>
+          <w:p>
+            <w:pPr>
+              <w:spacing w:before="0" w:after="60"/>
+              <w:keepNext/>
+              <w:jc w:val="center"/>
+            </w:pPr>
+            <w:r>
+              <w:rPr>
+                <w:rFonts w:ascii="Calibri" w:hAnsi="Calibri"/>
+                <w:sz w:val="20"/>
+              </w:rPr>
+              <w:t xml:space="preserve">↓ STX1A, ↑ SLC6A1, ↑ SLC12A2, ↑ PRKCB, ↑ RNF34, ↑ CDK5, ↑ PRKCA, ↑ PRKCG, ↑ REST, ↑ GRK2, ↑ ARRB2, ↑ KCTD12, ↑ RGS4, ↑ MECP2, ↑ RGS6</w:t>
+            </w:r>
+          </w:p>
+        </w:tc>
+        <w:tc>
+          <w:tcPr>
+            <w:tcBorders>
+              <w:top w:val="single" w:space="0" w:color="D3D3D3"/>
+              <w:bottom w:val="single" w:space="0" w:color="D3D3D3"/>
+              <w:start w:val="single" w:space="0" w:color="D3D3D3"/>
+              <w:end w:val="single" w:space="0" w:color="D3D3D3"/>
+            </w:tcBorders>
+          </w:tcPr>
+          <w:p>
+            <w:pPr>
+              <w:spacing w:before="0" w:after="60"/>
+              <w:keepNext/>
+              <w:jc w:val="center"/>
+            </w:pPr>
+            <w:r>
+              <w:rPr>
+                <w:rFonts w:ascii="Calibri" w:hAnsi="Calibri"/>
+                <w:sz w:val="20"/>
+              </w:rPr>
+              <w:t xml:space="preserve">↑ GAT1, ↓ GABA B receptor, ↓ GABA A receptor</w:t>
             </w:r>
           </w:p>
         </w:tc>
@@ -976,7 +976,7 @@
                 <w:sz w:val="20"/>
                 <w:b w:val="true"/>
               </w:rPr>
-              <w:t xml:space="preserve">Betamethasone</w:t>
+              <w:t xml:space="preserve">Metformin</w:t>
             </w:r>
           </w:p>
         </w:tc>
@@ -1026,7 +1026,7 @@
                 <w:rFonts w:ascii="Calibri" w:hAnsi="Calibri"/>
                 <w:sz w:val="20"/>
               </w:rPr>
-              <w:t xml:space="preserve">↑ GRK2, ↑ GRK3, ↑ ARRB2, ↑ RGS4, ↑ RGS6, ↑ RGS7, ↑ REST, ↑ MECP2</w:t>
+              <w:t xml:space="preserve">↓ STX1A, ↑ STING1, ↑ SLC6A1, ↓ GABRG2, ↑ SLC12A2, ↑ PRKCB, ↑ GSK3B, ↑ RNF34, ↑ CDK5, ↓ GABRA1, ↓ GABRB2, ↑ PRKCG, ↑ REST, ↑ GRK2, ↑ ARRB2, ↑ KCTD12, ↑ RGS4, ↑ RGS6</w:t>
             </w:r>
           </w:p>
         </w:tc>
@@ -1051,7 +1051,7 @@
                 <w:rFonts w:ascii="Calibri" w:hAnsi="Calibri"/>
                 <w:sz w:val="20"/>
               </w:rPr>
-              <w:t xml:space="preserve">↓ GABA B receptor</w:t>
+              <w:t xml:space="preserve">↑ GAT1, ↓ GABA B receptor, ↓ GABA A receptor</w:t>
             </w:r>
           </w:p>
         </w:tc>
@@ -1082,7 +1082,7 @@
                 <w:sz w:val="20"/>
                 <w:b w:val="true"/>
               </w:rPr>
-              <w:t xml:space="preserve">Lovastatin</w:t>
+              <w:t xml:space="preserve">Propranolol</w:t>
             </w:r>
           </w:p>
         </w:tc>
@@ -1130,31 +1130,31 @@
                 <w:rFonts w:ascii="Calibri" w:hAnsi="Calibri"/>
                 <w:sz w:val="20"/>
               </w:rPr>
-              <w:t xml:space="preserve">↑ KCTD12, ↑ KCTD16, ↑ GRK2, ↑ GRK3, ↑ ARRB2, ↑ RGS4, ↑ RGS6, ↑ RGS7, ↑ REST, ↑ MECP2</w:t>
-            </w:r>
-          </w:p>
-        </w:tc>
-        <w:tc>
-          <w:tcPr>
-            <w:tcBorders>
-              <w:top w:val="single" w:space="0" w:color="D3D3D3"/>
-              <w:bottom w:val="single" w:space="0" w:color="D3D3D3"/>
-              <w:start w:val="single" w:space="0" w:color="D3D3D3"/>
-              <w:end w:val="single" w:space="0" w:color="D3D3D3"/>
-            </w:tcBorders>
-          </w:tcPr>
-          <w:p>
-            <w:pPr>
-              <w:spacing w:before="0" w:after="60"/>
-              <w:keepNext/>
-              <w:jc w:val="center"/>
-            </w:pPr>
-            <w:r>
-              <w:rPr>
-                <w:rFonts w:ascii="Calibri" w:hAnsi="Calibri"/>
-                <w:sz w:val="20"/>
-              </w:rPr>
-              <w:t xml:space="preserve">↓ GABA B receptor</w:t>
+              <w:t xml:space="preserve">↓ STX1A, ↑ STING1, ↑ SLC6A1, ↓ GABRG2, ↑ SLC12A2, ↑ PRKCB, ↑ RNF34, ↑ CDK5, ↓ GABBR1, ↑ GRK3, ↑ REST, ↑ GRK2, ↑ ARRB2, ↑ KCTD12, ↑ RGS4, ↑ RGS6</w:t>
+            </w:r>
+          </w:p>
+        </w:tc>
+        <w:tc>
+          <w:tcPr>
+            <w:tcBorders>
+              <w:top w:val="single" w:space="0" w:color="D3D3D3"/>
+              <w:bottom w:val="single" w:space="0" w:color="D3D3D3"/>
+              <w:start w:val="single" w:space="0" w:color="D3D3D3"/>
+              <w:end w:val="single" w:space="0" w:color="D3D3D3"/>
+            </w:tcBorders>
+          </w:tcPr>
+          <w:p>
+            <w:pPr>
+              <w:spacing w:before="0" w:after="60"/>
+              <w:keepNext/>
+              <w:jc w:val="center"/>
+            </w:pPr>
+            <w:r>
+              <w:rPr>
+                <w:rFonts w:ascii="Calibri" w:hAnsi="Calibri"/>
+                <w:sz w:val="20"/>
+              </w:rPr>
+              <w:t xml:space="preserve">↑ GAT1, ↓ GABA B receptor, ↓ GABA A receptor</w:t>
             </w:r>
           </w:p>
         </w:tc>
@@ -1185,7 +1185,7 @@
                 <w:sz w:val="20"/>
                 <w:b w:val="true"/>
               </w:rPr>
-              <w:t xml:space="preserve">Lidocaine</w:t>
+              <w:t xml:space="preserve">Pyridoxine</w:t>
             </w:r>
           </w:p>
         </w:tc>
@@ -1210,7 +1210,7 @@
                 <w:rFonts w:ascii="Calibri" w:hAnsi="Calibri"/>
                 <w:sz w:val="20"/>
               </w:rPr>
-              <w:t xml:space="preserve">5</w:t>
+              <w:t xml:space="preserve">6</w:t>
             </w:r>
           </w:p>
         </w:tc>
@@ -1235,7 +1235,7 @@
                 <w:rFonts w:ascii="Calibri" w:hAnsi="Calibri"/>
                 <w:sz w:val="20"/>
               </w:rPr>
-              <w:t xml:space="preserve">↑ KCTD12, ↑ KCTD16, ↑ GRK2, ↑ GRK3, ↑ ARRB2, ↑ RGS4, ↑ RGS6, ↑ RGS7, ↑ REST, ↑ MECP2, ↓ GABBR1</w:t>
+              <w:t xml:space="preserve">↓ STX1A, ↓ GABBR1</w:t>
             </w:r>
           </w:p>
         </w:tc>
@@ -1260,7 +1260,7 @@
                 <w:rFonts w:ascii="Calibri" w:hAnsi="Calibri"/>
                 <w:sz w:val="20"/>
               </w:rPr>
-              <w:t xml:space="preserve">↓ GABA B receptor</w:t>
+              <w:t xml:space="preserve">↑ GAT1, ↓ GABA B receptor</w:t>
             </w:r>
           </w:p>
         </w:tc>
@@ -1291,79 +1291,79 @@
                 <w:sz w:val="20"/>
                 <w:b w:val="true"/>
               </w:rPr>
-              <w:t xml:space="preserve">Acamprosate</w:t>
-            </w:r>
-          </w:p>
-        </w:tc>
-        <w:tc>
-          <w:tcPr>
-            <w:tcBorders>
-              <w:top w:val="single" w:space="0" w:color="D3D3D3"/>
-              <w:bottom w:val="single" w:space="0" w:color="D3D3D3"/>
-              <w:start w:val="single" w:space="0" w:color="D3D3D3"/>
-              <w:end w:val="single" w:space="0" w:color="D3D3D3"/>
-            </w:tcBorders>
-          </w:tcPr>
-          <w:p>
-            <w:pPr>
-              <w:spacing w:before="0" w:after="60"/>
-              <w:keepNext/>
-              <w:jc w:val="center"/>
-            </w:pPr>
-            <w:r>
-              <w:rPr>
-                <w:rFonts w:ascii="Calibri" w:hAnsi="Calibri"/>
-                <w:sz w:val="20"/>
-              </w:rPr>
-              <w:t xml:space="preserve">3</w:t>
-            </w:r>
-          </w:p>
-        </w:tc>
-        <w:tc>
-          <w:tcPr>
-            <w:tcBorders>
-              <w:top w:val="single" w:space="0" w:color="D3D3D3"/>
-              <w:bottom w:val="single" w:space="0" w:color="D3D3D3"/>
-              <w:start w:val="single" w:space="0" w:color="D3D3D3"/>
-              <w:end w:val="single" w:space="0" w:color="D3D3D3"/>
-            </w:tcBorders>
-          </w:tcPr>
-          <w:p>
-            <w:pPr>
-              <w:spacing w:before="0" w:after="60"/>
-              <w:keepNext/>
-              <w:jc w:val="center"/>
-            </w:pPr>
-            <w:r>
-              <w:rPr>
-                <w:rFonts w:ascii="Calibri" w:hAnsi="Calibri"/>
-                <w:sz w:val="20"/>
-              </w:rPr>
-              <w:t xml:space="preserve">↓ GABBR1, ↓ GABBR2</w:t>
-            </w:r>
-          </w:p>
-        </w:tc>
-        <w:tc>
-          <w:tcPr>
-            <w:tcBorders>
-              <w:top w:val="single" w:space="0" w:color="D3D3D3"/>
-              <w:bottom w:val="single" w:space="0" w:color="D3D3D3"/>
-              <w:start w:val="single" w:space="0" w:color="D3D3D3"/>
-              <w:end w:val="single" w:space="0" w:color="D3D3D3"/>
-            </w:tcBorders>
-          </w:tcPr>
-          <w:p>
-            <w:pPr>
-              <w:spacing w:before="0" w:after="60"/>
-              <w:keepNext/>
-              <w:jc w:val="center"/>
-            </w:pPr>
-            <w:r>
-              <w:rPr>
-                <w:rFonts w:ascii="Calibri" w:hAnsi="Calibri"/>
-                <w:sz w:val="20"/>
-              </w:rPr>
-              <w:t xml:space="preserve">↓ GABA B receptor</w:t>
+              <w:t xml:space="preserve">Triamcinolone</w:t>
+            </w:r>
+          </w:p>
+        </w:tc>
+        <w:tc>
+          <w:tcPr>
+            <w:tcBorders>
+              <w:top w:val="single" w:space="0" w:color="D3D3D3"/>
+              <w:bottom w:val="single" w:space="0" w:color="D3D3D3"/>
+              <w:start w:val="single" w:space="0" w:color="D3D3D3"/>
+              <w:end w:val="single" w:space="0" w:color="D3D3D3"/>
+            </w:tcBorders>
+          </w:tcPr>
+          <w:p>
+            <w:pPr>
+              <w:spacing w:before="0" w:after="60"/>
+              <w:keepNext/>
+              <w:jc w:val="center"/>
+            </w:pPr>
+            <w:r>
+              <w:rPr>
+                <w:rFonts w:ascii="Calibri" w:hAnsi="Calibri"/>
+                <w:sz w:val="20"/>
+              </w:rPr>
+              <w:t xml:space="preserve">6</w:t>
+            </w:r>
+          </w:p>
+        </w:tc>
+        <w:tc>
+          <w:tcPr>
+            <w:tcBorders>
+              <w:top w:val="single" w:space="0" w:color="D3D3D3"/>
+              <w:bottom w:val="single" w:space="0" w:color="D3D3D3"/>
+              <w:start w:val="single" w:space="0" w:color="D3D3D3"/>
+              <w:end w:val="single" w:space="0" w:color="D3D3D3"/>
+            </w:tcBorders>
+          </w:tcPr>
+          <w:p>
+            <w:pPr>
+              <w:spacing w:before="0" w:after="60"/>
+              <w:keepNext/>
+              <w:jc w:val="center"/>
+            </w:pPr>
+            <w:r>
+              <w:rPr>
+                <w:rFonts w:ascii="Calibri" w:hAnsi="Calibri"/>
+                <w:sz w:val="20"/>
+              </w:rPr>
+              <w:t xml:space="preserve">↑ STING1, ↑ RGS6</w:t>
+            </w:r>
+          </w:p>
+        </w:tc>
+        <w:tc>
+          <w:tcPr>
+            <w:tcBorders>
+              <w:top w:val="single" w:space="0" w:color="D3D3D3"/>
+              <w:bottom w:val="single" w:space="0" w:color="D3D3D3"/>
+              <w:start w:val="single" w:space="0" w:color="D3D3D3"/>
+              <w:end w:val="single" w:space="0" w:color="D3D3D3"/>
+            </w:tcBorders>
+          </w:tcPr>
+          <w:p>
+            <w:pPr>
+              <w:spacing w:before="0" w:after="60"/>
+              <w:keepNext/>
+              <w:jc w:val="center"/>
+            </w:pPr>
+            <w:r>
+              <w:rPr>
+                <w:rFonts w:ascii="Calibri" w:hAnsi="Calibri"/>
+                <w:sz w:val="20"/>
+              </w:rPr>
+              <w:t xml:space="preserve">↑ GAT1, ↓ GABA B receptor</w:t>
             </w:r>
           </w:p>
         </w:tc>
@@ -1394,7 +1394,7 @@
                 <w:sz w:val="20"/>
                 <w:b w:val="true"/>
               </w:rPr>
-              <w:t xml:space="preserve">Azelaic acid</w:t>
+              <w:t xml:space="preserve">Calcitriol</w:t>
             </w:r>
           </w:p>
         </w:tc>
@@ -1419,7 +1419,7 @@
                 <w:rFonts w:ascii="Calibri" w:hAnsi="Calibri"/>
                 <w:sz w:val="20"/>
               </w:rPr>
-              <w:t xml:space="preserve">6</w:t>
+              <w:t xml:space="preserve">5</w:t>
             </w:r>
           </w:p>
         </w:tc>
@@ -1444,7 +1444,7 @@
                 <w:rFonts w:ascii="Calibri" w:hAnsi="Calibri"/>
                 <w:sz w:val="20"/>
               </w:rPr>
-              <w:t xml:space="preserve">↑ PRKCA, ↑ PRKCB, ↑ PRKCG, ↑ CDK5, ↑ GSK3B, ↑ RNF34, ↑ SLC12A2</w:t>
+              <w:t xml:space="preserve">↓ STX1A, ↑ STING1, ↓ GABRG2, ↑ SLC12A2, ↑ PRKCB, ↑ GSK3B, ↑ RNF34, ↑ CDK5, ↑ REST, ↑ GRK2, ↑ ARRB2, ↑ KCTD12, ↑ RGS4, ↑ RGS6</w:t>
             </w:r>
           </w:p>
         </w:tc>
@@ -1469,7 +1469,7 @@
                 <w:rFonts w:ascii="Calibri" w:hAnsi="Calibri"/>
                 <w:sz w:val="20"/>
               </w:rPr>
-              <w:t xml:space="preserve">↓ GABA A receptor</w:t>
+              <w:t xml:space="preserve">↑ GAT1, ↓ GABA B receptor, ↓ GABA A receptor</w:t>
             </w:r>
           </w:p>
         </w:tc>
@@ -1500,79 +1500,79 @@
                 <w:sz w:val="20"/>
                 <w:b w:val="true"/>
               </w:rPr>
-              <w:t xml:space="preserve">Buspirone</w:t>
-            </w:r>
-          </w:p>
-        </w:tc>
-        <w:tc>
-          <w:tcPr>
-            <w:tcBorders>
-              <w:top w:val="single" w:space="0" w:color="D3D3D3"/>
-              <w:bottom w:val="single" w:space="0" w:color="D3D3D3"/>
-              <w:start w:val="single" w:space="0" w:color="D3D3D3"/>
-              <w:end w:val="single" w:space="0" w:color="D3D3D3"/>
-            </w:tcBorders>
-          </w:tcPr>
-          <w:p>
-            <w:pPr>
-              <w:spacing w:before="0" w:after="60"/>
-              <w:keepNext/>
-              <w:jc w:val="center"/>
-            </w:pPr>
-            <w:r>
-              <w:rPr>
-                <w:rFonts w:ascii="Calibri" w:hAnsi="Calibri"/>
-                <w:sz w:val="20"/>
-              </w:rPr>
-              <w:t xml:space="preserve">6</w:t>
-            </w:r>
-          </w:p>
-        </w:tc>
-        <w:tc>
-          <w:tcPr>
-            <w:tcBorders>
-              <w:top w:val="single" w:space="0" w:color="D3D3D3"/>
-              <w:bottom w:val="single" w:space="0" w:color="D3D3D3"/>
-              <w:start w:val="single" w:space="0" w:color="D3D3D3"/>
-              <w:end w:val="single" w:space="0" w:color="D3D3D3"/>
-            </w:tcBorders>
-          </w:tcPr>
-          <w:p>
-            <w:pPr>
-              <w:spacing w:before="0" w:after="60"/>
-              <w:keepNext/>
-              <w:jc w:val="center"/>
-            </w:pPr>
-            <w:r>
-              <w:rPr>
-                <w:rFonts w:ascii="Calibri" w:hAnsi="Calibri"/>
-                <w:sz w:val="20"/>
-              </w:rPr>
-              <w:t xml:space="preserve">↑ PRKCA, ↑ PRKCB, ↑ PRKCG, ↑ CDK5, ↑ GSK3B, ↑ RNF34, ↑ SLC12A2, ↑ STING1, ↑ TBK1, ↑ IRF3</w:t>
-            </w:r>
-          </w:p>
-        </w:tc>
-        <w:tc>
-          <w:tcPr>
-            <w:tcBorders>
-              <w:top w:val="single" w:space="0" w:color="D3D3D3"/>
-              <w:bottom w:val="single" w:space="0" w:color="D3D3D3"/>
-              <w:start w:val="single" w:space="0" w:color="D3D3D3"/>
-              <w:end w:val="single" w:space="0" w:color="D3D3D3"/>
-            </w:tcBorders>
-          </w:tcPr>
-          <w:p>
-            <w:pPr>
-              <w:spacing w:before="0" w:after="60"/>
-              <w:keepNext/>
-              <w:jc w:val="center"/>
-            </w:pPr>
-            <w:r>
-              <w:rPr>
-                <w:rFonts w:ascii="Calibri" w:hAnsi="Calibri"/>
-                <w:sz w:val="20"/>
-              </w:rPr>
-              <w:t xml:space="preserve">↓ GABA A receptor</w:t>
+              <w:t xml:space="preserve">Guanfacine</w:t>
+            </w:r>
+          </w:p>
+        </w:tc>
+        <w:tc>
+          <w:tcPr>
+            <w:tcBorders>
+              <w:top w:val="single" w:space="0" w:color="D3D3D3"/>
+              <w:bottom w:val="single" w:space="0" w:color="D3D3D3"/>
+              <w:start w:val="single" w:space="0" w:color="D3D3D3"/>
+              <w:end w:val="single" w:space="0" w:color="D3D3D3"/>
+            </w:tcBorders>
+          </w:tcPr>
+          <w:p>
+            <w:pPr>
+              <w:spacing w:before="0" w:after="60"/>
+              <w:keepNext/>
+              <w:jc w:val="center"/>
+            </w:pPr>
+            <w:r>
+              <w:rPr>
+                <w:rFonts w:ascii="Calibri" w:hAnsi="Calibri"/>
+                <w:sz w:val="20"/>
+              </w:rPr>
+              <w:t xml:space="preserve">5</w:t>
+            </w:r>
+          </w:p>
+        </w:tc>
+        <w:tc>
+          <w:tcPr>
+            <w:tcBorders>
+              <w:top w:val="single" w:space="0" w:color="D3D3D3"/>
+              <w:bottom w:val="single" w:space="0" w:color="D3D3D3"/>
+              <w:start w:val="single" w:space="0" w:color="D3D3D3"/>
+              <w:end w:val="single" w:space="0" w:color="D3D3D3"/>
+            </w:tcBorders>
+          </w:tcPr>
+          <w:p>
+            <w:pPr>
+              <w:spacing w:before="0" w:after="60"/>
+              <w:keepNext/>
+              <w:jc w:val="center"/>
+            </w:pPr>
+            <w:r>
+              <w:rPr>
+                <w:rFonts w:ascii="Calibri" w:hAnsi="Calibri"/>
+                <w:sz w:val="20"/>
+              </w:rPr>
+              <w:t xml:space="preserve">↓ STX1A, ↑ REST</w:t>
+            </w:r>
+          </w:p>
+        </w:tc>
+        <w:tc>
+          <w:tcPr>
+            <w:tcBorders>
+              <w:top w:val="single" w:space="0" w:color="D3D3D3"/>
+              <w:bottom w:val="single" w:space="0" w:color="D3D3D3"/>
+              <w:start w:val="single" w:space="0" w:color="D3D3D3"/>
+              <w:end w:val="single" w:space="0" w:color="D3D3D3"/>
+            </w:tcBorders>
+          </w:tcPr>
+          <w:p>
+            <w:pPr>
+              <w:spacing w:before="0" w:after="60"/>
+              <w:keepNext/>
+              <w:jc w:val="center"/>
+            </w:pPr>
+            <w:r>
+              <w:rPr>
+                <w:rFonts w:ascii="Calibri" w:hAnsi="Calibri"/>
+                <w:sz w:val="20"/>
+              </w:rPr>
+              <w:t xml:space="preserve">↑ GAT1, ↓ GABA B receptor</w:t>
             </w:r>
           </w:p>
         </w:tc>
@@ -1603,7 +1603,7 @@
                 <w:sz w:val="20"/>
                 <w:b w:val="true"/>
               </w:rPr>
-              <w:t xml:space="preserve">Fluvoxamine</w:t>
+              <w:t xml:space="preserve">Levetiracetam</w:t>
             </w:r>
           </w:p>
         </w:tc>
@@ -1628,7 +1628,7 @@
                 <w:rFonts w:ascii="Calibri" w:hAnsi="Calibri"/>
                 <w:sz w:val="20"/>
               </w:rPr>
-              <w:t xml:space="preserve">6</w:t>
+              <w:t xml:space="preserve">5</w:t>
             </w:r>
           </w:p>
         </w:tc>
@@ -1653,7 +1653,7 @@
                 <w:rFonts w:ascii="Calibri" w:hAnsi="Calibri"/>
                 <w:sz w:val="20"/>
               </w:rPr>
-              <w:t xml:space="preserve">↑ PRKCA, ↑ PRKCB, ↑ PRKCG, ↑ CDK5, ↑ GSK3B, ↑ RNF34, ↑ SLC12A2, ↑ STING1, ↑ TBK1, ↑ IRF3</w:t>
+              <w:t xml:space="preserve">↑ SLC6A1, ↑ CDK5, ↑ RGS6</w:t>
             </w:r>
           </w:p>
         </w:tc>
@@ -1678,7 +1678,7 @@
                 <w:rFonts w:ascii="Calibri" w:hAnsi="Calibri"/>
                 <w:sz w:val="20"/>
               </w:rPr>
-              <w:t xml:space="preserve">↓ GABA A receptor</w:t>
+              <w:t xml:space="preserve">↑ GAT1, ↓ GABA B receptor, ↓ GABA A receptor</w:t>
             </w:r>
           </w:p>
         </w:tc>
@@ -1709,79 +1709,79 @@
                 <w:sz w:val="20"/>
                 <w:b w:val="true"/>
               </w:rPr>
-              <w:t xml:space="preserve">Triamcinolone</w:t>
-            </w:r>
-          </w:p>
-        </w:tc>
-        <w:tc>
-          <w:tcPr>
-            <w:tcBorders>
-              <w:top w:val="single" w:space="0" w:color="D3D3D3"/>
-              <w:bottom w:val="single" w:space="0" w:color="D3D3D3"/>
-              <w:start w:val="single" w:space="0" w:color="D3D3D3"/>
-              <w:end w:val="single" w:space="0" w:color="D3D3D3"/>
-            </w:tcBorders>
-          </w:tcPr>
-          <w:p>
-            <w:pPr>
-              <w:spacing w:before="0" w:after="60"/>
-              <w:keepNext/>
-              <w:jc w:val="center"/>
-            </w:pPr>
-            <w:r>
-              <w:rPr>
-                <w:rFonts w:ascii="Calibri" w:hAnsi="Calibri"/>
-                <w:sz w:val="20"/>
-              </w:rPr>
-              <w:t xml:space="preserve">6</w:t>
-            </w:r>
-          </w:p>
-        </w:tc>
-        <w:tc>
-          <w:tcPr>
-            <w:tcBorders>
-              <w:top w:val="single" w:space="0" w:color="D3D3D3"/>
-              <w:bottom w:val="single" w:space="0" w:color="D3D3D3"/>
-              <w:start w:val="single" w:space="0" w:color="D3D3D3"/>
-              <w:end w:val="single" w:space="0" w:color="D3D3D3"/>
-            </w:tcBorders>
-          </w:tcPr>
-          <w:p>
-            <w:pPr>
-              <w:spacing w:before="0" w:after="60"/>
-              <w:keepNext/>
-              <w:jc w:val="center"/>
-            </w:pPr>
-            <w:r>
-              <w:rPr>
-                <w:rFonts w:ascii="Calibri" w:hAnsi="Calibri"/>
-                <w:sz w:val="20"/>
-              </w:rPr>
-              <w:t xml:space="preserve">↑ PRKCA, ↑ PRKCB, ↑ PRKCG, ↑ CDK5, ↑ GSK3B, ↑ RNF34, ↑ SLC12A2, ↑ STING1, ↑ TBK1, ↑ IRF3</w:t>
-            </w:r>
-          </w:p>
-        </w:tc>
-        <w:tc>
-          <w:tcPr>
-            <w:tcBorders>
-              <w:top w:val="single" w:space="0" w:color="D3D3D3"/>
-              <w:bottom w:val="single" w:space="0" w:color="D3D3D3"/>
-              <w:start w:val="single" w:space="0" w:color="D3D3D3"/>
-              <w:end w:val="single" w:space="0" w:color="D3D3D3"/>
-            </w:tcBorders>
-          </w:tcPr>
-          <w:p>
-            <w:pPr>
-              <w:spacing w:before="0" w:after="60"/>
-              <w:keepNext/>
-              <w:jc w:val="center"/>
-            </w:pPr>
-            <w:r>
-              <w:rPr>
-                <w:rFonts w:ascii="Calibri" w:hAnsi="Calibri"/>
-                <w:sz w:val="20"/>
-              </w:rPr>
-              <w:t xml:space="preserve">↓ GABA A receptor</w:t>
+              <w:t xml:space="preserve">Memantine</w:t>
+            </w:r>
+          </w:p>
+        </w:tc>
+        <w:tc>
+          <w:tcPr>
+            <w:tcBorders>
+              <w:top w:val="single" w:space="0" w:color="D3D3D3"/>
+              <w:bottom w:val="single" w:space="0" w:color="D3D3D3"/>
+              <w:start w:val="single" w:space="0" w:color="D3D3D3"/>
+              <w:end w:val="single" w:space="0" w:color="D3D3D3"/>
+            </w:tcBorders>
+          </w:tcPr>
+          <w:p>
+            <w:pPr>
+              <w:spacing w:before="0" w:after="60"/>
+              <w:keepNext/>
+              <w:jc w:val="center"/>
+            </w:pPr>
+            <w:r>
+              <w:rPr>
+                <w:rFonts w:ascii="Calibri" w:hAnsi="Calibri"/>
+                <w:sz w:val="20"/>
+              </w:rPr>
+              <w:t xml:space="preserve">5</w:t>
+            </w:r>
+          </w:p>
+        </w:tc>
+        <w:tc>
+          <w:tcPr>
+            <w:tcBorders>
+              <w:top w:val="single" w:space="0" w:color="D3D3D3"/>
+              <w:bottom w:val="single" w:space="0" w:color="D3D3D3"/>
+              <w:start w:val="single" w:space="0" w:color="D3D3D3"/>
+              <w:end w:val="single" w:space="0" w:color="D3D3D3"/>
+            </w:tcBorders>
+          </w:tcPr>
+          <w:p>
+            <w:pPr>
+              <w:spacing w:before="0" w:after="60"/>
+              <w:keepNext/>
+              <w:jc w:val="center"/>
+            </w:pPr>
+            <w:r>
+              <w:rPr>
+                <w:rFonts w:ascii="Calibri" w:hAnsi="Calibri"/>
+                <w:sz w:val="20"/>
+              </w:rPr>
+              <w:t xml:space="preserve">↓ STX1A, ↑ SLC6A1, ↑ SLC12A2, ↑ RNF34, ↑ CDK5, ↑ PRKCA, ↑ PRKCB, ↑ REST, ↑ GRK2</w:t>
+            </w:r>
+          </w:p>
+        </w:tc>
+        <w:tc>
+          <w:tcPr>
+            <w:tcBorders>
+              <w:top w:val="single" w:space="0" w:color="D3D3D3"/>
+              <w:bottom w:val="single" w:space="0" w:color="D3D3D3"/>
+              <w:start w:val="single" w:space="0" w:color="D3D3D3"/>
+              <w:end w:val="single" w:space="0" w:color="D3D3D3"/>
+            </w:tcBorders>
+          </w:tcPr>
+          <w:p>
+            <w:pPr>
+              <w:spacing w:before="0" w:after="60"/>
+              <w:keepNext/>
+              <w:jc w:val="center"/>
+            </w:pPr>
+            <w:r>
+              <w:rPr>
+                <w:rFonts w:ascii="Calibri" w:hAnsi="Calibri"/>
+                <w:sz w:val="20"/>
+              </w:rPr>
+              <w:t xml:space="preserve">↑ GAT1, ↓ GABA B receptor, ↓ GABA A receptor</w:t>
             </w:r>
           </w:p>
         </w:tc>
@@ -1812,7 +1812,7 @@
                 <w:sz w:val="20"/>
                 <w:b w:val="true"/>
               </w:rPr>
-              <w:t xml:space="preserve">Dextromethorphan</w:t>
+              <w:t xml:space="preserve">Azelaic acid</w:t>
             </w:r>
           </w:p>
         </w:tc>
@@ -1837,7 +1837,7 @@
                 <w:rFonts w:ascii="Calibri" w:hAnsi="Calibri"/>
                 <w:sz w:val="20"/>
               </w:rPr>
-              <w:t xml:space="preserve">5</w:t>
+              <w:t xml:space="preserve">6</w:t>
             </w:r>
           </w:p>
         </w:tc>
@@ -1862,7 +1862,7 @@
                 <w:rFonts w:ascii="Calibri" w:hAnsi="Calibri"/>
                 <w:sz w:val="20"/>
               </w:rPr>
-              <w:t xml:space="preserve">↑ CDK5, ↑ GSK3B, ↑ RNF34, ↑ SLC12A2, ↑ STING1, ↑ TBK1, ↑ IRF3</w:t>
+              <w:t xml:space="preserve">↑ REST</w:t>
             </w:r>
           </w:p>
         </w:tc>
@@ -1887,7 +1887,7 @@
                 <w:rFonts w:ascii="Calibri" w:hAnsi="Calibri"/>
                 <w:sz w:val="20"/>
               </w:rPr>
-              <w:t xml:space="preserve">↓ GABA A receptor</w:t>
+              <w:t xml:space="preserve">↓ GABA B receptor</w:t>
             </w:r>
           </w:p>
         </w:tc>
@@ -1918,66 +1918,799 @@
                 <w:sz w:val="20"/>
                 <w:b w:val="true"/>
               </w:rPr>
-              <w:t xml:space="preserve">Desflurane</w:t>
-            </w:r>
-          </w:p>
-        </w:tc>
-        <w:tc>
-          <w:tcPr>
-            <w:tcBorders>
-              <w:top w:val="single" w:space="0" w:color="D3D3D3"/>
-              <w:bottom w:val="single" w:space="0" w:color="D3D3D3"/>
-              <w:start w:val="single" w:space="0" w:color="D3D3D3"/>
-              <w:end w:val="single" w:space="0" w:color="D3D3D3"/>
-            </w:tcBorders>
-          </w:tcPr>
-          <w:p>
-            <w:pPr>
-              <w:spacing w:before="0" w:after="60"/>
-              <w:keepNext/>
-              <w:jc w:val="center"/>
-            </w:pPr>
-            <w:r>
-              <w:rPr>
-                <w:rFonts w:ascii="Calibri" w:hAnsi="Calibri"/>
-                <w:sz w:val="20"/>
-              </w:rPr>
-              <w:t xml:space="preserve">3</w:t>
-            </w:r>
-          </w:p>
-        </w:tc>
-        <w:tc>
-          <w:tcPr>
-            <w:tcBorders>
-              <w:top w:val="single" w:space="0" w:color="D3D3D3"/>
-              <w:bottom w:val="single" w:space="0" w:color="D3D3D3"/>
-              <w:start w:val="single" w:space="0" w:color="D3D3D3"/>
-              <w:end w:val="single" w:space="0" w:color="D3D3D3"/>
-            </w:tcBorders>
-          </w:tcPr>
-          <w:p>
-            <w:pPr>
-              <w:spacing w:before="0" w:after="60"/>
-              <w:keepNext/>
-              <w:jc w:val="center"/>
-            </w:pPr>
-            <w:r>
-              <w:rPr>
-                <w:rFonts w:ascii="Calibri" w:hAnsi="Calibri"/>
-                <w:sz w:val="20"/>
-              </w:rPr>
-              <w:t xml:space="preserve">↓ GABRA1, ↓ GABRB2, ↓ GABRG2, ↑ SLC12A2</w:t>
-            </w:r>
-          </w:p>
-        </w:tc>
-        <w:tc>
-          <w:tcPr>
-            <w:tcBorders>
-              <w:top w:val="single" w:space="0" w:color="D3D3D3"/>
-              <w:bottom w:val="single" w:space="0" w:color="D3D3D3"/>
-              <w:start w:val="single" w:space="0" w:color="D3D3D3"/>
-              <w:end w:val="single" w:space="0" w:color="D3D3D3"/>
-            </w:tcBorders>
+              <w:t xml:space="preserve">Buspirone</w:t>
+            </w:r>
+          </w:p>
+        </w:tc>
+        <w:tc>
+          <w:tcPr>
+            <w:tcBorders>
+              <w:top w:val="single" w:space="0" w:color="D3D3D3"/>
+              <w:bottom w:val="single" w:space="0" w:color="D3D3D3"/>
+              <w:start w:val="single" w:space="0" w:color="D3D3D3"/>
+              <w:end w:val="single" w:space="0" w:color="D3D3D3"/>
+            </w:tcBorders>
+          </w:tcPr>
+          <w:p>
+            <w:pPr>
+              <w:spacing w:before="0" w:after="60"/>
+              <w:keepNext/>
+              <w:jc w:val="center"/>
+            </w:pPr>
+            <w:r>
+              <w:rPr>
+                <w:rFonts w:ascii="Calibri" w:hAnsi="Calibri"/>
+                <w:sz w:val="20"/>
+              </w:rPr>
+              <w:t xml:space="preserve">6</w:t>
+            </w:r>
+          </w:p>
+        </w:tc>
+        <w:tc>
+          <w:tcPr>
+            <w:tcBorders>
+              <w:top w:val="single" w:space="0" w:color="D3D3D3"/>
+              <w:bottom w:val="single" w:space="0" w:color="D3D3D3"/>
+              <w:start w:val="single" w:space="0" w:color="D3D3D3"/>
+              <w:end w:val="single" w:space="0" w:color="D3D3D3"/>
+            </w:tcBorders>
+          </w:tcPr>
+          <w:p>
+            <w:pPr>
+              <w:spacing w:before="0" w:after="60"/>
+              <w:keepNext/>
+              <w:jc w:val="center"/>
+            </w:pPr>
+            <w:r>
+              <w:rPr>
+                <w:rFonts w:ascii="Calibri" w:hAnsi="Calibri"/>
+                <w:sz w:val="20"/>
+              </w:rPr>
+              <w:t xml:space="preserve">↑ REST</w:t>
+            </w:r>
+          </w:p>
+        </w:tc>
+        <w:tc>
+          <w:tcPr>
+            <w:tcBorders>
+              <w:top w:val="single" w:space="0" w:color="D3D3D3"/>
+              <w:bottom w:val="single" w:space="0" w:color="D3D3D3"/>
+              <w:start w:val="single" w:space="0" w:color="D3D3D3"/>
+              <w:end w:val="single" w:space="0" w:color="D3D3D3"/>
+            </w:tcBorders>
+          </w:tcPr>
+          <w:p>
+            <w:pPr>
+              <w:spacing w:before="0" w:after="60"/>
+              <w:keepNext/>
+              <w:jc w:val="center"/>
+            </w:pPr>
+            <w:r>
+              <w:rPr>
+                <w:rFonts w:ascii="Calibri" w:hAnsi="Calibri"/>
+                <w:sz w:val="20"/>
+              </w:rPr>
+              <w:t xml:space="preserve">↓ GABA B receptor</w:t>
+            </w:r>
+          </w:p>
+        </w:tc>
+      </w:tr>
+      <w:tr>
+        <w:trPr>
+          <w:cantSplit/>
+        </w:trPr>
+        <w:tc>
+          <w:tcPr>
+            <w:tcBorders>
+              <w:top w:val="single" w:space="0" w:color="D3D3D3"/>
+              <w:bottom w:val="single" w:space="0" w:color="D3D3D3"/>
+              <w:start w:val="single" w:space="0" w:color="D3D3D3"/>
+              <w:end w:val="single" w:space="0" w:color="D3D3D3"/>
+            </w:tcBorders>
+            <w:shd w:val="clear" w:color="auto" w:fill="E5E5E5"/>
+          </w:tcPr>
+          <w:p>
+            <w:pPr>
+              <w:spacing w:before="0" w:after="60"/>
+              <w:keepNext/>
+              <w:jc w:val="center"/>
+            </w:pPr>
+            <w:r>
+              <w:rPr>
+                <w:rFonts w:ascii="Calibri" w:hAnsi="Calibri"/>
+                <w:sz w:val="20"/>
+                <w:b w:val="true"/>
+              </w:rPr>
+              <w:t xml:space="preserve">Fluvoxamine</w:t>
+            </w:r>
+          </w:p>
+        </w:tc>
+        <w:tc>
+          <w:tcPr>
+            <w:tcBorders>
+              <w:top w:val="single" w:space="0" w:color="D3D3D3"/>
+              <w:bottom w:val="single" w:space="0" w:color="D3D3D3"/>
+              <w:start w:val="single" w:space="0" w:color="D3D3D3"/>
+              <w:end w:val="single" w:space="0" w:color="D3D3D3"/>
+            </w:tcBorders>
+            <w:shd w:val="clear" w:color="auto" w:fill="F2F2F2"/>
+          </w:tcPr>
+          <w:p>
+            <w:pPr>
+              <w:spacing w:before="0" w:after="60"/>
+              <w:keepNext/>
+              <w:jc w:val="center"/>
+            </w:pPr>
+            <w:r>
+              <w:rPr>
+                <w:rFonts w:ascii="Calibri" w:hAnsi="Calibri"/>
+                <w:sz w:val="20"/>
+              </w:rPr>
+              <w:t xml:space="preserve">6</w:t>
+            </w:r>
+          </w:p>
+        </w:tc>
+        <w:tc>
+          <w:tcPr>
+            <w:tcBorders>
+              <w:top w:val="single" w:space="0" w:color="D3D3D3"/>
+              <w:bottom w:val="single" w:space="0" w:color="D3D3D3"/>
+              <w:start w:val="single" w:space="0" w:color="D3D3D3"/>
+              <w:end w:val="single" w:space="0" w:color="D3D3D3"/>
+            </w:tcBorders>
+            <w:shd w:val="clear" w:color="auto" w:fill="F2F2F2"/>
+          </w:tcPr>
+          <w:p>
+            <w:pPr>
+              <w:spacing w:before="0" w:after="60"/>
+              <w:keepNext/>
+              <w:jc w:val="center"/>
+            </w:pPr>
+            <w:r>
+              <w:rPr>
+                <w:rFonts w:ascii="Calibri" w:hAnsi="Calibri"/>
+                <w:sz w:val="20"/>
+              </w:rPr>
+              <w:t xml:space="preserve">↑ SLC12A2, ↑ RGS6, ↑ REST</w:t>
+            </w:r>
+          </w:p>
+        </w:tc>
+        <w:tc>
+          <w:tcPr>
+            <w:tcBorders>
+              <w:top w:val="single" w:space="0" w:color="D3D3D3"/>
+              <w:bottom w:val="single" w:space="0" w:color="D3D3D3"/>
+              <w:start w:val="single" w:space="0" w:color="D3D3D3"/>
+              <w:end w:val="single" w:space="0" w:color="D3D3D3"/>
+            </w:tcBorders>
+            <w:shd w:val="clear" w:color="auto" w:fill="F2F2F2"/>
+          </w:tcPr>
+          <w:p>
+            <w:pPr>
+              <w:spacing w:before="0" w:after="60"/>
+              <w:keepNext/>
+              <w:jc w:val="center"/>
+            </w:pPr>
+            <w:r>
+              <w:rPr>
+                <w:rFonts w:ascii="Calibri" w:hAnsi="Calibri"/>
+                <w:sz w:val="20"/>
+              </w:rPr>
+              <w:t xml:space="preserve">↓ GABA B receptor, ↓ GABA A receptor</w:t>
+            </w:r>
+          </w:p>
+        </w:tc>
+      </w:tr>
+      <w:tr>
+        <w:trPr>
+          <w:cantSplit/>
+        </w:trPr>
+        <w:tc>
+          <w:tcPr>
+            <w:tcBorders>
+              <w:top w:val="single" w:space="0" w:color="D3D3D3"/>
+              <w:bottom w:val="single" w:space="0" w:color="D3D3D3"/>
+              <w:start w:val="single" w:space="0" w:color="D3D3D3"/>
+              <w:end w:val="single" w:space="0" w:color="D3D3D3"/>
+            </w:tcBorders>
+            <w:shd w:val="clear" w:color="auto" w:fill="E5E5E5"/>
+          </w:tcPr>
+          <w:p>
+            <w:pPr>
+              <w:spacing w:before="0" w:after="60"/>
+              <w:keepNext/>
+              <w:jc w:val="center"/>
+            </w:pPr>
+            <w:r>
+              <w:rPr>
+                <w:rFonts w:ascii="Calibri" w:hAnsi="Calibri"/>
+                <w:sz w:val="20"/>
+                <w:b w:val="true"/>
+              </w:rPr>
+              <w:t xml:space="preserve">Metoprolol</w:t>
+            </w:r>
+          </w:p>
+        </w:tc>
+        <w:tc>
+          <w:tcPr>
+            <w:tcBorders>
+              <w:top w:val="single" w:space="0" w:color="D3D3D3"/>
+              <w:bottom w:val="single" w:space="0" w:color="D3D3D3"/>
+              <w:start w:val="single" w:space="0" w:color="D3D3D3"/>
+              <w:end w:val="single" w:space="0" w:color="D3D3D3"/>
+            </w:tcBorders>
+          </w:tcPr>
+          <w:p>
+            <w:pPr>
+              <w:spacing w:before="0" w:after="60"/>
+              <w:keepNext/>
+              <w:jc w:val="center"/>
+            </w:pPr>
+            <w:r>
+              <w:rPr>
+                <w:rFonts w:ascii="Calibri" w:hAnsi="Calibri"/>
+                <w:sz w:val="20"/>
+              </w:rPr>
+              <w:t xml:space="preserve">6</w:t>
+            </w:r>
+          </w:p>
+        </w:tc>
+        <w:tc>
+          <w:tcPr>
+            <w:tcBorders>
+              <w:top w:val="single" w:space="0" w:color="D3D3D3"/>
+              <w:bottom w:val="single" w:space="0" w:color="D3D3D3"/>
+              <w:start w:val="single" w:space="0" w:color="D3D3D3"/>
+              <w:end w:val="single" w:space="0" w:color="D3D3D3"/>
+            </w:tcBorders>
+          </w:tcPr>
+          <w:p>
+            <w:pPr>
+              <w:spacing w:before="0" w:after="60"/>
+              <w:keepNext/>
+              <w:jc w:val="center"/>
+            </w:pPr>
+            <w:r>
+              <w:rPr>
+                <w:rFonts w:ascii="Calibri" w:hAnsi="Calibri"/>
+                <w:sz w:val="20"/>
+              </w:rPr>
+              <w:t xml:space="preserve">↓ GABRG2, ↑ CDK5, ↑ GRK3, ↑ REST, ↑ RGS6</w:t>
+            </w:r>
+          </w:p>
+        </w:tc>
+        <w:tc>
+          <w:tcPr>
+            <w:tcBorders>
+              <w:top w:val="single" w:space="0" w:color="D3D3D3"/>
+              <w:bottom w:val="single" w:space="0" w:color="D3D3D3"/>
+              <w:start w:val="single" w:space="0" w:color="D3D3D3"/>
+              <w:end w:val="single" w:space="0" w:color="D3D3D3"/>
+            </w:tcBorders>
+          </w:tcPr>
+          <w:p>
+            <w:pPr>
+              <w:spacing w:before="0" w:after="60"/>
+              <w:keepNext/>
+              <w:jc w:val="center"/>
+            </w:pPr>
+            <w:r>
+              <w:rPr>
+                <w:rFonts w:ascii="Calibri" w:hAnsi="Calibri"/>
+                <w:sz w:val="20"/>
+              </w:rPr>
+              <w:t xml:space="preserve">↓ GABA B receptor, ↓ GABA A receptor</w:t>
+            </w:r>
+          </w:p>
+        </w:tc>
+      </w:tr>
+      <w:tr>
+        <w:trPr>
+          <w:cantSplit/>
+        </w:trPr>
+        <w:tc>
+          <w:tcPr>
+            <w:tcBorders>
+              <w:top w:val="single" w:space="0" w:color="D3D3D3"/>
+              <w:bottom w:val="single" w:space="0" w:color="D3D3D3"/>
+              <w:start w:val="single" w:space="0" w:color="D3D3D3"/>
+              <w:end w:val="single" w:space="0" w:color="D3D3D3"/>
+            </w:tcBorders>
+            <w:shd w:val="clear" w:color="auto" w:fill="E5E5E5"/>
+          </w:tcPr>
+          <w:p>
+            <w:pPr>
+              <w:spacing w:before="0" w:after="60"/>
+              <w:keepNext/>
+              <w:jc w:val="center"/>
+            </w:pPr>
+            <w:r>
+              <w:rPr>
+                <w:rFonts w:ascii="Calibri" w:hAnsi="Calibri"/>
+                <w:sz w:val="20"/>
+                <w:b w:val="true"/>
+              </w:rPr>
+              <w:t xml:space="preserve">Captopril</w:t>
+            </w:r>
+          </w:p>
+        </w:tc>
+        <w:tc>
+          <w:tcPr>
+            <w:tcBorders>
+              <w:top w:val="single" w:space="0" w:color="D3D3D3"/>
+              <w:bottom w:val="single" w:space="0" w:color="D3D3D3"/>
+              <w:start w:val="single" w:space="0" w:color="D3D3D3"/>
+              <w:end w:val="single" w:space="0" w:color="D3D3D3"/>
+            </w:tcBorders>
+            <w:shd w:val="clear" w:color="auto" w:fill="F2F2F2"/>
+          </w:tcPr>
+          <w:p>
+            <w:pPr>
+              <w:spacing w:before="0" w:after="60"/>
+              <w:keepNext/>
+              <w:jc w:val="center"/>
+            </w:pPr>
+            <w:r>
+              <w:rPr>
+                <w:rFonts w:ascii="Calibri" w:hAnsi="Calibri"/>
+                <w:sz w:val="20"/>
+              </w:rPr>
+              <w:t xml:space="preserve">5</w:t>
+            </w:r>
+          </w:p>
+        </w:tc>
+        <w:tc>
+          <w:tcPr>
+            <w:tcBorders>
+              <w:top w:val="single" w:space="0" w:color="D3D3D3"/>
+              <w:bottom w:val="single" w:space="0" w:color="D3D3D3"/>
+              <w:start w:val="single" w:space="0" w:color="D3D3D3"/>
+              <w:end w:val="single" w:space="0" w:color="D3D3D3"/>
+            </w:tcBorders>
+            <w:shd w:val="clear" w:color="auto" w:fill="F2F2F2"/>
+          </w:tcPr>
+          <w:p>
+            <w:pPr>
+              <w:spacing w:before="0" w:after="60"/>
+              <w:keepNext/>
+              <w:jc w:val="center"/>
+            </w:pPr>
+            <w:r>
+              <w:rPr>
+                <w:rFonts w:ascii="Calibri" w:hAnsi="Calibri"/>
+                <w:sz w:val="20"/>
+              </w:rPr>
+              <w:t xml:space="preserve">↓ GABRG2, ↑ SLC12A2, ↑ PRKCB, ↑ PRKCG, ↓ GABBR1, ↑ REST, ↑ GRK2, ↑ ARRB2, ↑ RGS6</w:t>
+            </w:r>
+          </w:p>
+        </w:tc>
+        <w:tc>
+          <w:tcPr>
+            <w:tcBorders>
+              <w:top w:val="single" w:space="0" w:color="D3D3D3"/>
+              <w:bottom w:val="single" w:space="0" w:color="D3D3D3"/>
+              <w:start w:val="single" w:space="0" w:color="D3D3D3"/>
+              <w:end w:val="single" w:space="0" w:color="D3D3D3"/>
+            </w:tcBorders>
+            <w:shd w:val="clear" w:color="auto" w:fill="F2F2F2"/>
+          </w:tcPr>
+          <w:p>
+            <w:pPr>
+              <w:spacing w:before="0" w:after="60"/>
+              <w:keepNext/>
+              <w:jc w:val="center"/>
+            </w:pPr>
+            <w:r>
+              <w:rPr>
+                <w:rFonts w:ascii="Calibri" w:hAnsi="Calibri"/>
+                <w:sz w:val="20"/>
+              </w:rPr>
+              <w:t xml:space="preserve">↓ GABA B receptor, ↓ GABA A receptor</w:t>
+            </w:r>
+          </w:p>
+        </w:tc>
+      </w:tr>
+      <w:tr>
+        <w:trPr>
+          <w:cantSplit/>
+        </w:trPr>
+        <w:tc>
+          <w:tcPr>
+            <w:tcBorders>
+              <w:top w:val="single" w:space="0" w:color="D3D3D3"/>
+              <w:bottom w:val="single" w:space="0" w:color="D3D3D3"/>
+              <w:start w:val="single" w:space="0" w:color="D3D3D3"/>
+              <w:end w:val="single" w:space="0" w:color="D3D3D3"/>
+            </w:tcBorders>
+            <w:shd w:val="clear" w:color="auto" w:fill="E5E5E5"/>
+          </w:tcPr>
+          <w:p>
+            <w:pPr>
+              <w:spacing w:before="0" w:after="60"/>
+              <w:keepNext/>
+              <w:jc w:val="center"/>
+            </w:pPr>
+            <w:r>
+              <w:rPr>
+                <w:rFonts w:ascii="Calibri" w:hAnsi="Calibri"/>
+                <w:sz w:val="20"/>
+                <w:b w:val="true"/>
+              </w:rPr>
+              <w:t xml:space="preserve">Ezetimibe</w:t>
+            </w:r>
+          </w:p>
+        </w:tc>
+        <w:tc>
+          <w:tcPr>
+            <w:tcBorders>
+              <w:top w:val="single" w:space="0" w:color="D3D3D3"/>
+              <w:bottom w:val="single" w:space="0" w:color="D3D3D3"/>
+              <w:start w:val="single" w:space="0" w:color="D3D3D3"/>
+              <w:end w:val="single" w:space="0" w:color="D3D3D3"/>
+            </w:tcBorders>
+          </w:tcPr>
+          <w:p>
+            <w:pPr>
+              <w:spacing w:before="0" w:after="60"/>
+              <w:keepNext/>
+              <w:jc w:val="center"/>
+            </w:pPr>
+            <w:r>
+              <w:rPr>
+                <w:rFonts w:ascii="Calibri" w:hAnsi="Calibri"/>
+                <w:sz w:val="20"/>
+              </w:rPr>
+              <w:t xml:space="preserve">5</w:t>
+            </w:r>
+          </w:p>
+        </w:tc>
+        <w:tc>
+          <w:tcPr>
+            <w:tcBorders>
+              <w:top w:val="single" w:space="0" w:color="D3D3D3"/>
+              <w:bottom w:val="single" w:space="0" w:color="D3D3D3"/>
+              <w:start w:val="single" w:space="0" w:color="D3D3D3"/>
+              <w:end w:val="single" w:space="0" w:color="D3D3D3"/>
+            </w:tcBorders>
+          </w:tcPr>
+          <w:p>
+            <w:pPr>
+              <w:spacing w:before="0" w:after="60"/>
+              <w:keepNext/>
+              <w:jc w:val="center"/>
+            </w:pPr>
+            <w:r>
+              <w:rPr>
+                <w:rFonts w:ascii="Calibri" w:hAnsi="Calibri"/>
+                <w:sz w:val="20"/>
+              </w:rPr>
+              <w:t xml:space="preserve">↑ SLC12A2, ↑ PRKCB, ↑ RNF34, ↑ ARRB2</w:t>
+            </w:r>
+          </w:p>
+        </w:tc>
+        <w:tc>
+          <w:tcPr>
+            <w:tcBorders>
+              <w:top w:val="single" w:space="0" w:color="D3D3D3"/>
+              <w:bottom w:val="single" w:space="0" w:color="D3D3D3"/>
+              <w:start w:val="single" w:space="0" w:color="D3D3D3"/>
+              <w:end w:val="single" w:space="0" w:color="D3D3D3"/>
+            </w:tcBorders>
+          </w:tcPr>
+          <w:p>
+            <w:pPr>
+              <w:spacing w:before="0" w:after="60"/>
+              <w:keepNext/>
+              <w:jc w:val="center"/>
+            </w:pPr>
+            <w:r>
+              <w:rPr>
+                <w:rFonts w:ascii="Calibri" w:hAnsi="Calibri"/>
+                <w:sz w:val="20"/>
+              </w:rPr>
+              <w:t xml:space="preserve">↓ GABA B receptor, ↓ GABA A receptor</w:t>
+            </w:r>
+          </w:p>
+        </w:tc>
+      </w:tr>
+      <w:tr>
+        <w:trPr>
+          <w:cantSplit/>
+        </w:trPr>
+        <w:tc>
+          <w:tcPr>
+            <w:tcBorders>
+              <w:top w:val="single" w:space="0" w:color="D3D3D3"/>
+              <w:bottom w:val="single" w:space="0" w:color="D3D3D3"/>
+              <w:start w:val="single" w:space="0" w:color="D3D3D3"/>
+              <w:end w:val="single" w:space="0" w:color="D3D3D3"/>
+            </w:tcBorders>
+            <w:shd w:val="clear" w:color="auto" w:fill="E5E5E5"/>
+          </w:tcPr>
+          <w:p>
+            <w:pPr>
+              <w:spacing w:before="0" w:after="60"/>
+              <w:keepNext/>
+              <w:jc w:val="center"/>
+            </w:pPr>
+            <w:r>
+              <w:rPr>
+                <w:rFonts w:ascii="Calibri" w:hAnsi="Calibri"/>
+                <w:sz w:val="20"/>
+                <w:b w:val="true"/>
+              </w:rPr>
+              <w:t xml:space="preserve">Methylprednisolone</w:t>
+            </w:r>
+          </w:p>
+        </w:tc>
+        <w:tc>
+          <w:tcPr>
+            <w:tcBorders>
+              <w:top w:val="single" w:space="0" w:color="D3D3D3"/>
+              <w:bottom w:val="single" w:space="0" w:color="D3D3D3"/>
+              <w:start w:val="single" w:space="0" w:color="D3D3D3"/>
+              <w:end w:val="single" w:space="0" w:color="D3D3D3"/>
+            </w:tcBorders>
+            <w:shd w:val="clear" w:color="auto" w:fill="F2F2F2"/>
+          </w:tcPr>
+          <w:p>
+            <w:pPr>
+              <w:spacing w:before="0" w:after="60"/>
+              <w:keepNext/>
+              <w:jc w:val="center"/>
+            </w:pPr>
+            <w:r>
+              <w:rPr>
+                <w:rFonts w:ascii="Calibri" w:hAnsi="Calibri"/>
+                <w:sz w:val="20"/>
+              </w:rPr>
+              <w:t xml:space="preserve">5</w:t>
+            </w:r>
+          </w:p>
+        </w:tc>
+        <w:tc>
+          <w:tcPr>
+            <w:tcBorders>
+              <w:top w:val="single" w:space="0" w:color="D3D3D3"/>
+              <w:bottom w:val="single" w:space="0" w:color="D3D3D3"/>
+              <w:start w:val="single" w:space="0" w:color="D3D3D3"/>
+              <w:end w:val="single" w:space="0" w:color="D3D3D3"/>
+            </w:tcBorders>
+            <w:shd w:val="clear" w:color="auto" w:fill="F2F2F2"/>
+          </w:tcPr>
+          <w:p>
+            <w:pPr>
+              <w:spacing w:before="0" w:after="60"/>
+              <w:keepNext/>
+              <w:jc w:val="center"/>
+            </w:pPr>
+            <w:r>
+              <w:rPr>
+                <w:rFonts w:ascii="Calibri" w:hAnsi="Calibri"/>
+                <w:sz w:val="20"/>
+              </w:rPr>
+              <w:t xml:space="preserve">↑ SLC12A2, ↑ PRKCB, ↑ CDK5, ↓ GABBR1, ↑ REST, ↑ GRK2, ↑ ARRB2, ↑ RGS4, ↑ RGS6</w:t>
+            </w:r>
+          </w:p>
+        </w:tc>
+        <w:tc>
+          <w:tcPr>
+            <w:tcBorders>
+              <w:top w:val="single" w:space="0" w:color="D3D3D3"/>
+              <w:bottom w:val="single" w:space="0" w:color="D3D3D3"/>
+              <w:start w:val="single" w:space="0" w:color="D3D3D3"/>
+              <w:end w:val="single" w:space="0" w:color="D3D3D3"/>
+            </w:tcBorders>
+            <w:shd w:val="clear" w:color="auto" w:fill="F2F2F2"/>
+          </w:tcPr>
+          <w:p>
+            <w:pPr>
+              <w:spacing w:before="0" w:after="60"/>
+              <w:keepNext/>
+              <w:jc w:val="center"/>
+            </w:pPr>
+            <w:r>
+              <w:rPr>
+                <w:rFonts w:ascii="Calibri" w:hAnsi="Calibri"/>
+                <w:sz w:val="20"/>
+              </w:rPr>
+              <w:t xml:space="preserve">↓ GABA B receptor, ↓ GABA A receptor</w:t>
+            </w:r>
+          </w:p>
+        </w:tc>
+      </w:tr>
+      <w:tr>
+        <w:trPr>
+          <w:cantSplit/>
+        </w:trPr>
+        <w:tc>
+          <w:tcPr>
+            <w:tcBorders>
+              <w:top w:val="single" w:space="0" w:color="D3D3D3"/>
+              <w:bottom w:val="single" w:space="0" w:color="D3D3D3"/>
+              <w:start w:val="single" w:space="0" w:color="D3D3D3"/>
+              <w:end w:val="single" w:space="0" w:color="D3D3D3"/>
+            </w:tcBorders>
+            <w:shd w:val="clear" w:color="auto" w:fill="E5E5E5"/>
+          </w:tcPr>
+          <w:p>
+            <w:pPr>
+              <w:spacing w:before="0" w:after="60"/>
+              <w:keepNext/>
+              <w:jc w:val="center"/>
+            </w:pPr>
+            <w:r>
+              <w:rPr>
+                <w:rFonts w:ascii="Calibri" w:hAnsi="Calibri"/>
+                <w:sz w:val="20"/>
+                <w:b w:val="true"/>
+              </w:rPr>
+              <w:t xml:space="preserve">Sertraline</w:t>
+            </w:r>
+          </w:p>
+        </w:tc>
+        <w:tc>
+          <w:tcPr>
+            <w:tcBorders>
+              <w:top w:val="single" w:space="0" w:color="D3D3D3"/>
+              <w:bottom w:val="single" w:space="0" w:color="D3D3D3"/>
+              <w:start w:val="single" w:space="0" w:color="D3D3D3"/>
+              <w:end w:val="single" w:space="0" w:color="D3D3D3"/>
+            </w:tcBorders>
+          </w:tcPr>
+          <w:p>
+            <w:pPr>
+              <w:spacing w:before="0" w:after="60"/>
+              <w:keepNext/>
+              <w:jc w:val="center"/>
+            </w:pPr>
+            <w:r>
+              <w:rPr>
+                <w:rFonts w:ascii="Calibri" w:hAnsi="Calibri"/>
+                <w:sz w:val="20"/>
+              </w:rPr>
+              <w:t xml:space="preserve">6</w:t>
+            </w:r>
+          </w:p>
+        </w:tc>
+        <w:tc>
+          <w:tcPr>
+            <w:tcBorders>
+              <w:top w:val="single" w:space="0" w:color="D3D3D3"/>
+              <w:bottom w:val="single" w:space="0" w:color="D3D3D3"/>
+              <w:start w:val="single" w:space="0" w:color="D3D3D3"/>
+              <w:end w:val="single" w:space="0" w:color="D3D3D3"/>
+            </w:tcBorders>
+          </w:tcPr>
+          <w:p>
+            <w:pPr>
+              <w:spacing w:before="0" w:after="60"/>
+              <w:keepNext/>
+              <w:jc w:val="center"/>
+            </w:pPr>
+            <w:r>
+              <w:rPr>
+                <w:rFonts w:ascii="Calibri" w:hAnsi="Calibri"/>
+                <w:sz w:val="20"/>
+              </w:rPr>
+              <w:t xml:space="preserve">↑ RNF34</w:t>
+            </w:r>
+          </w:p>
+        </w:tc>
+        <w:tc>
+          <w:tcPr>
+            <w:tcBorders>
+              <w:top w:val="single" w:space="0" w:color="D3D3D3"/>
+              <w:bottom w:val="single" w:space="0" w:color="D3D3D3"/>
+              <w:start w:val="single" w:space="0" w:color="D3D3D3"/>
+              <w:end w:val="single" w:space="0" w:color="D3D3D3"/>
+            </w:tcBorders>
+          </w:tcPr>
+          <w:p>
+            <w:pPr>
+              <w:spacing w:before="0" w:after="60"/>
+              <w:keepNext/>
+              <w:jc w:val="center"/>
+            </w:pPr>
+            <w:r>
+              <w:rPr>
+                <w:rFonts w:ascii="Calibri" w:hAnsi="Calibri"/>
+                <w:sz w:val="20"/>
+              </w:rPr>
+              <w:t xml:space="preserve">↓ GABA A receptor</w:t>
+            </w:r>
+          </w:p>
+        </w:tc>
+      </w:tr>
+      <w:tr>
+        <w:trPr>
+          <w:cantSplit/>
+        </w:trPr>
+        <w:tc>
+          <w:tcPr>
+            <w:tcBorders>
+              <w:top w:val="single" w:space="0" w:color="D3D3D3"/>
+              <w:bottom w:val="single" w:space="0" w:color="D3D3D3"/>
+              <w:start w:val="single" w:space="0" w:color="D3D3D3"/>
+              <w:end w:val="single" w:space="0" w:color="D3D3D3"/>
+            </w:tcBorders>
+            <w:shd w:val="clear" w:color="auto" w:fill="E5E5E5"/>
+          </w:tcPr>
+          <w:p>
+            <w:pPr>
+              <w:spacing w:before="0" w:after="60"/>
+              <w:keepNext/>
+              <w:jc w:val="center"/>
+            </w:pPr>
+            <w:r>
+              <w:rPr>
+                <w:rFonts w:ascii="Calibri" w:hAnsi="Calibri"/>
+                <w:sz w:val="20"/>
+                <w:b w:val="true"/>
+              </w:rPr>
+              <w:t xml:space="preserve">Dextromethorphan</w:t>
+            </w:r>
+          </w:p>
+        </w:tc>
+        <w:tc>
+          <w:tcPr>
+            <w:tcBorders>
+              <w:top w:val="single" w:space="0" w:color="D3D3D3"/>
+              <w:bottom w:val="single" w:space="0" w:color="D3D3D3"/>
+              <w:start w:val="single" w:space="0" w:color="D3D3D3"/>
+              <w:end w:val="single" w:space="0" w:color="D3D3D3"/>
+            </w:tcBorders>
+            <w:shd w:val="clear" w:color="auto" w:fill="F2F2F2"/>
+          </w:tcPr>
+          <w:p>
+            <w:pPr>
+              <w:spacing w:before="0" w:after="60"/>
+              <w:keepNext/>
+              <w:jc w:val="center"/>
+            </w:pPr>
+            <w:r>
+              <w:rPr>
+                <w:rFonts w:ascii="Calibri" w:hAnsi="Calibri"/>
+                <w:sz w:val="20"/>
+              </w:rPr>
+              <w:t xml:space="preserve">5</w:t>
+            </w:r>
+          </w:p>
+        </w:tc>
+        <w:tc>
+          <w:tcPr>
+            <w:tcBorders>
+              <w:top w:val="single" w:space="0" w:color="D3D3D3"/>
+              <w:bottom w:val="single" w:space="0" w:color="D3D3D3"/>
+              <w:start w:val="single" w:space="0" w:color="D3D3D3"/>
+              <w:end w:val="single" w:space="0" w:color="D3D3D3"/>
+            </w:tcBorders>
+            <w:shd w:val="clear" w:color="auto" w:fill="F2F2F2"/>
+          </w:tcPr>
+          <w:p>
+            <w:pPr>
+              <w:spacing w:before="0" w:after="60"/>
+              <w:keepNext/>
+              <w:jc w:val="center"/>
+            </w:pPr>
+            <w:r>
+              <w:rPr>
+                <w:rFonts w:ascii="Calibri" w:hAnsi="Calibri"/>
+                <w:sz w:val="20"/>
+              </w:rPr>
+              <w:t xml:space="preserve">↑ CDK5</w:t>
+            </w:r>
+          </w:p>
+        </w:tc>
+        <w:tc>
+          <w:tcPr>
+            <w:tcBorders>
+              <w:top w:val="single" w:space="0" w:color="D3D3D3"/>
+              <w:bottom w:val="single" w:space="0" w:color="D3D3D3"/>
+              <w:start w:val="single" w:space="0" w:color="D3D3D3"/>
+              <w:end w:val="single" w:space="0" w:color="D3D3D3"/>
+            </w:tcBorders>
+            <w:shd w:val="clear" w:color="auto" w:fill="F2F2F2"/>
           </w:tcPr>
           <w:p>
             <w:pPr>

</xml_diff>

<commit_message>
Change A and B to subscript
</commit_message>
<xml_diff>
--- a/SLC6A1 Grant.docx
+++ b/SLC6A1 Grant.docx
@@ -190,7 +190,7 @@
                 <w:rFonts w:ascii="Calibri" w:hAnsi="Calibri"/>
                 <w:sz w:val="20"/>
               </w:rPr>
-              <w:t xml:space="preserve">↓ STX1A, ↑ STING1, ↑ SLC6A1, ↑ TBK1, ↓ GABRG2, ↑ SLC12A2, ↑ PRKCB, ↑ RNF34, ↑ CDK5, ↑ PRKCG, ↑ GRK3, ↑ REST, ↑ GRK2, ↑ ARRB2, ↑ KCTD12, ↑ RGS4, ↑ RGS6</w:t>
+              <w:t xml:space="preserve">↑ STING1, ↓ GABRG2, ↑ ARRB2</w:t>
             </w:r>
           </w:p>
         </w:tc>
@@ -215,7 +215,13 @@
                 <w:rFonts w:ascii="Calibri" w:hAnsi="Calibri"/>
                 <w:sz w:val="20"/>
               </w:rPr>
-              <w:t xml:space="preserve">↑ GAT1, ↓ GABA B receptor, ↓ GABA A receptor</w:t>
+              <w:t xml:space="preserve">
+                ↑ GAT1, ↓ GABA
+                <sub>B</sub>
+                 receptor, ↓ GABA
+                <sub>A</sub>
+                 receptor
+              </w:t>
             </w:r>
           </w:p>
         </w:tc>
@@ -294,31 +300,37 @@
                 <w:rFonts w:ascii="Calibri" w:hAnsi="Calibri"/>
                 <w:sz w:val="20"/>
               </w:rPr>
-              <w:t xml:space="preserve">↑ STING1, ↑ SLC6A1, ↑ SLC12A2, ↑ PRKCB, ↓ GABBR1, ↑ REST, ↑ RGS4, ↑ RGS6</w:t>
-            </w:r>
-          </w:p>
-        </w:tc>
-        <w:tc>
-          <w:tcPr>
-            <w:tcBorders>
-              <w:top w:val="single" w:space="0" w:color="D3D3D3"/>
-              <w:bottom w:val="single" w:space="0" w:color="D3D3D3"/>
-              <w:start w:val="single" w:space="0" w:color="D3D3D3"/>
-              <w:end w:val="single" w:space="0" w:color="D3D3D3"/>
-            </w:tcBorders>
-          </w:tcPr>
-          <w:p>
-            <w:pPr>
-              <w:spacing w:before="0" w:after="60"/>
-              <w:keepNext/>
-              <w:jc w:val="center"/>
-            </w:pPr>
-            <w:r>
-              <w:rPr>
-                <w:rFonts w:ascii="Calibri" w:hAnsi="Calibri"/>
-                <w:sz w:val="20"/>
-              </w:rPr>
-              <w:t xml:space="preserve">↑ GAT1, ↓ GABA B receptor, ↓ GABA A receptor</w:t>
+              <w:t xml:space="preserve">↑ STING1, ↑ SLC12A2, ↓ GABBR1</w:t>
+            </w:r>
+          </w:p>
+        </w:tc>
+        <w:tc>
+          <w:tcPr>
+            <w:tcBorders>
+              <w:top w:val="single" w:space="0" w:color="D3D3D3"/>
+              <w:bottom w:val="single" w:space="0" w:color="D3D3D3"/>
+              <w:start w:val="single" w:space="0" w:color="D3D3D3"/>
+              <w:end w:val="single" w:space="0" w:color="D3D3D3"/>
+            </w:tcBorders>
+          </w:tcPr>
+          <w:p>
+            <w:pPr>
+              <w:spacing w:before="0" w:after="60"/>
+              <w:keepNext/>
+              <w:jc w:val="center"/>
+            </w:pPr>
+            <w:r>
+              <w:rPr>
+                <w:rFonts w:ascii="Calibri" w:hAnsi="Calibri"/>
+                <w:sz w:val="20"/>
+              </w:rPr>
+              <w:t xml:space="preserve">
+                ↑ GAT1, ↓ GABA
+                <sub>B</sub>
+                 receptor, ↓ GABA
+                <sub>A</sub>
+                 receptor
+              </w:t>
             </w:r>
           </w:p>
         </w:tc>
@@ -399,7 +411,7 @@
                 <w:rFonts w:ascii="Calibri" w:hAnsi="Calibri"/>
                 <w:sz w:val="20"/>
               </w:rPr>
-              <w:t xml:space="preserve">↓ STX1A, ↑ STING1, ↓ GABRG2, ↑ PRKCB, ↑ GRK2, ↑ ARRB2, ↑ RGS4, ↑ RGS6</w:t>
+              <w:t xml:space="preserve">↑ STING1, ↓ GABRG2, ↑ RGS6</w:t>
             </w:r>
           </w:p>
         </w:tc>
@@ -424,7 +436,13 @@
                 <w:rFonts w:ascii="Calibri" w:hAnsi="Calibri"/>
                 <w:sz w:val="20"/>
               </w:rPr>
-              <w:t xml:space="preserve">↑ GAT1, ↓ GABA B receptor, ↓ GABA A receptor</w:t>
+              <w:t xml:space="preserve">
+                ↑ GAT1, ↓ GABA
+                <sub>B</sub>
+                 receptor, ↓ GABA
+                <sub>A</sub>
+                 receptor
+              </w:t>
             </w:r>
           </w:p>
         </w:tc>
@@ -503,31 +521,37 @@
                 <w:rFonts w:ascii="Calibri" w:hAnsi="Calibri"/>
                 <w:sz w:val="20"/>
               </w:rPr>
-              <w:t xml:space="preserve">↓ STX1A, ↑ SLC6A1, ↑ SLC12A2, ↑ PRKCB, ↑ GRK3, ↑ ARRB2</w:t>
-            </w:r>
-          </w:p>
-        </w:tc>
-        <w:tc>
-          <w:tcPr>
-            <w:tcBorders>
-              <w:top w:val="single" w:space="0" w:color="D3D3D3"/>
-              <w:bottom w:val="single" w:space="0" w:color="D3D3D3"/>
-              <w:start w:val="single" w:space="0" w:color="D3D3D3"/>
-              <w:end w:val="single" w:space="0" w:color="D3D3D3"/>
-            </w:tcBorders>
-          </w:tcPr>
-          <w:p>
-            <w:pPr>
-              <w:spacing w:before="0" w:after="60"/>
-              <w:keepNext/>
-              <w:jc w:val="center"/>
-            </w:pPr>
-            <w:r>
-              <w:rPr>
-                <w:rFonts w:ascii="Calibri" w:hAnsi="Calibri"/>
-                <w:sz w:val="20"/>
-              </w:rPr>
-              <w:t xml:space="preserve">↑ GAT1, ↓ GABA B receptor, ↓ GABA A receptor</w:t>
+              <w:t xml:space="preserve">↑ SLC6A1, ↑ PRKCB, ↑ GRK3</w:t>
+            </w:r>
+          </w:p>
+        </w:tc>
+        <w:tc>
+          <w:tcPr>
+            <w:tcBorders>
+              <w:top w:val="single" w:space="0" w:color="D3D3D3"/>
+              <w:bottom w:val="single" w:space="0" w:color="D3D3D3"/>
+              <w:start w:val="single" w:space="0" w:color="D3D3D3"/>
+              <w:end w:val="single" w:space="0" w:color="D3D3D3"/>
+            </w:tcBorders>
+          </w:tcPr>
+          <w:p>
+            <w:pPr>
+              <w:spacing w:before="0" w:after="60"/>
+              <w:keepNext/>
+              <w:jc w:val="center"/>
+            </w:pPr>
+            <w:r>
+              <w:rPr>
+                <w:rFonts w:ascii="Calibri" w:hAnsi="Calibri"/>
+                <w:sz w:val="20"/>
+              </w:rPr>
+              <w:t xml:space="preserve">
+                ↑ GAT1, ↓ GABA
+                <sub>B</sub>
+                 receptor, ↓ GABA
+                <sub>A</sub>
+                 receptor
+              </w:t>
             </w:r>
           </w:p>
         </w:tc>
@@ -633,7 +657,11 @@
                 <w:rFonts w:ascii="Calibri" w:hAnsi="Calibri"/>
                 <w:sz w:val="20"/>
               </w:rPr>
-              <w:t xml:space="preserve">↑ GAT1, ↓ GABA A receptor</w:t>
+              <w:t xml:space="preserve">
+                ↑ GAT1, ↓ GABA
+                <sub>A</sub>
+                 receptor
+              </w:t>
             </w:r>
           </w:p>
         </w:tc>
@@ -736,7 +764,11 @@
                 <w:rFonts w:ascii="Calibri" w:hAnsi="Calibri"/>
                 <w:sz w:val="20"/>
               </w:rPr>
-              <w:t xml:space="preserve">↑ GAT1, ↓ GABA B receptor</w:t>
+              <w:t xml:space="preserve">
+                ↑ GAT1, ↓ GABA
+                <sub>B</sub>
+                 receptor
+              </w:t>
             </w:r>
           </w:p>
         </w:tc>
@@ -817,7 +849,7 @@
                 <w:rFonts w:ascii="Calibri" w:hAnsi="Calibri"/>
                 <w:sz w:val="20"/>
               </w:rPr>
-              <w:t xml:space="preserve">↑ STING1, ↑ CDK5, ↑ PRKCG, ↑ GRK2, ↑ ARRB2, ↑ RGS6</w:t>
+              <w:t xml:space="preserve">↑ STING1, ↑ PRKCG, ↑ GRK2</w:t>
             </w:r>
           </w:p>
         </w:tc>
@@ -842,7 +874,13 @@
                 <w:rFonts w:ascii="Calibri" w:hAnsi="Calibri"/>
                 <w:sz w:val="20"/>
               </w:rPr>
-              <w:t xml:space="preserve">↑ GAT1, ↓ GABA B receptor, ↓ GABA A receptor</w:t>
+              <w:t xml:space="preserve">
+                ↑ GAT1, ↓ GABA
+                <sub>B</sub>
+                 receptor, ↓ GABA
+                <sub>A</sub>
+                 receptor
+              </w:t>
             </w:r>
           </w:p>
         </w:tc>
@@ -921,31 +959,37 @@
                 <w:rFonts w:ascii="Calibri" w:hAnsi="Calibri"/>
                 <w:sz w:val="20"/>
               </w:rPr>
-              <w:t xml:space="preserve">↓ STX1A, ↑ SLC6A1, ↑ SLC12A2, ↑ PRKCB, ↑ RNF34, ↑ CDK5, ↑ PRKCA, ↑ PRKCG, ↑ REST, ↑ GRK2, ↑ ARRB2, ↑ KCTD12, ↑ RGS4, ↑ MECP2, ↑ RGS6</w:t>
-            </w:r>
-          </w:p>
-        </w:tc>
-        <w:tc>
-          <w:tcPr>
-            <w:tcBorders>
-              <w:top w:val="single" w:space="0" w:color="D3D3D3"/>
-              <w:bottom w:val="single" w:space="0" w:color="D3D3D3"/>
-              <w:start w:val="single" w:space="0" w:color="D3D3D3"/>
-              <w:end w:val="single" w:space="0" w:color="D3D3D3"/>
-            </w:tcBorders>
-          </w:tcPr>
-          <w:p>
-            <w:pPr>
-              <w:spacing w:before="0" w:after="60"/>
-              <w:keepNext/>
-              <w:jc w:val="center"/>
-            </w:pPr>
-            <w:r>
-              <w:rPr>
-                <w:rFonts w:ascii="Calibri" w:hAnsi="Calibri"/>
-                <w:sz w:val="20"/>
-              </w:rPr>
-              <w:t xml:space="preserve">↑ GAT1, ↓ GABA B receptor, ↓ GABA A receptor</w:t>
+              <w:t xml:space="preserve">↑ SLC6A1, ↑ PRKCA, ↑ MECP2</w:t>
+            </w:r>
+          </w:p>
+        </w:tc>
+        <w:tc>
+          <w:tcPr>
+            <w:tcBorders>
+              <w:top w:val="single" w:space="0" w:color="D3D3D3"/>
+              <w:bottom w:val="single" w:space="0" w:color="D3D3D3"/>
+              <w:start w:val="single" w:space="0" w:color="D3D3D3"/>
+              <w:end w:val="single" w:space="0" w:color="D3D3D3"/>
+            </w:tcBorders>
+          </w:tcPr>
+          <w:p>
+            <w:pPr>
+              <w:spacing w:before="0" w:after="60"/>
+              <w:keepNext/>
+              <w:jc w:val="center"/>
+            </w:pPr>
+            <w:r>
+              <w:rPr>
+                <w:rFonts w:ascii="Calibri" w:hAnsi="Calibri"/>
+                <w:sz w:val="20"/>
+              </w:rPr>
+              <w:t xml:space="preserve">
+                ↑ GAT1, ↓ GABA
+                <sub>B</sub>
+                 receptor, ↓ GABA
+                <sub>A</sub>
+                 receptor
+              </w:t>
             </w:r>
           </w:p>
         </w:tc>
@@ -1026,7 +1070,7 @@
                 <w:rFonts w:ascii="Calibri" w:hAnsi="Calibri"/>
                 <w:sz w:val="20"/>
               </w:rPr>
-              <w:t xml:space="preserve">↓ STX1A, ↑ STING1, ↑ SLC6A1, ↓ GABRG2, ↑ SLC12A2, ↑ PRKCB, ↑ GSK3B, ↑ RNF34, ↑ CDK5, ↓ GABRA1, ↓ GABRB2, ↑ PRKCG, ↑ REST, ↑ GRK2, ↑ ARRB2, ↑ KCTD12, ↑ RGS4, ↑ RGS6</w:t>
+              <w:t xml:space="preserve">↑ STING1, ↓ GABRA1, ↑ KCTD12</w:t>
             </w:r>
           </w:p>
         </w:tc>
@@ -1051,7 +1095,13 @@
                 <w:rFonts w:ascii="Calibri" w:hAnsi="Calibri"/>
                 <w:sz w:val="20"/>
               </w:rPr>
-              <w:t xml:space="preserve">↑ GAT1, ↓ GABA B receptor, ↓ GABA A receptor</w:t>
+              <w:t xml:space="preserve">
+                ↑ GAT1, ↓ GABA
+                <sub>B</sub>
+                 receptor, ↓ GABA
+                <sub>A</sub>
+                 receptor
+              </w:t>
             </w:r>
           </w:p>
         </w:tc>
@@ -1130,31 +1180,37 @@
                 <w:rFonts w:ascii="Calibri" w:hAnsi="Calibri"/>
                 <w:sz w:val="20"/>
               </w:rPr>
-              <w:t xml:space="preserve">↓ STX1A, ↑ STING1, ↑ SLC6A1, ↓ GABRG2, ↑ SLC12A2, ↑ PRKCB, ↑ RNF34, ↑ CDK5, ↓ GABBR1, ↑ GRK3, ↑ REST, ↑ GRK2, ↑ ARRB2, ↑ KCTD12, ↑ RGS4, ↑ RGS6</w:t>
-            </w:r>
-          </w:p>
-        </w:tc>
-        <w:tc>
-          <w:tcPr>
-            <w:tcBorders>
-              <w:top w:val="single" w:space="0" w:color="D3D3D3"/>
-              <w:bottom w:val="single" w:space="0" w:color="D3D3D3"/>
-              <w:start w:val="single" w:space="0" w:color="D3D3D3"/>
-              <w:end w:val="single" w:space="0" w:color="D3D3D3"/>
-            </w:tcBorders>
-          </w:tcPr>
-          <w:p>
-            <w:pPr>
-              <w:spacing w:before="0" w:after="60"/>
-              <w:keepNext/>
-              <w:jc w:val="center"/>
-            </w:pPr>
-            <w:r>
-              <w:rPr>
-                <w:rFonts w:ascii="Calibri" w:hAnsi="Calibri"/>
-                <w:sz w:val="20"/>
-              </w:rPr>
-              <w:t xml:space="preserve">↑ GAT1, ↓ GABA B receptor, ↓ GABA A receptor</w:t>
+              <w:t xml:space="preserve">↑ STING1, ↓ GABRG2, ↓ GABBR1</w:t>
+            </w:r>
+          </w:p>
+        </w:tc>
+        <w:tc>
+          <w:tcPr>
+            <w:tcBorders>
+              <w:top w:val="single" w:space="0" w:color="D3D3D3"/>
+              <w:bottom w:val="single" w:space="0" w:color="D3D3D3"/>
+              <w:start w:val="single" w:space="0" w:color="D3D3D3"/>
+              <w:end w:val="single" w:space="0" w:color="D3D3D3"/>
+            </w:tcBorders>
+          </w:tcPr>
+          <w:p>
+            <w:pPr>
+              <w:spacing w:before="0" w:after="60"/>
+              <w:keepNext/>
+              <w:jc w:val="center"/>
+            </w:pPr>
+            <w:r>
+              <w:rPr>
+                <w:rFonts w:ascii="Calibri" w:hAnsi="Calibri"/>
+                <w:sz w:val="20"/>
+              </w:rPr>
+              <w:t xml:space="preserve">
+                ↑ GAT1, ↓ GABA
+                <sub>B</sub>
+                 receptor, ↓ GABA
+                <sub>A</sub>
+                 receptor
+              </w:t>
             </w:r>
           </w:p>
         </w:tc>
@@ -1260,7 +1316,11 @@
                 <w:rFonts w:ascii="Calibri" w:hAnsi="Calibri"/>
                 <w:sz w:val="20"/>
               </w:rPr>
-              <w:t xml:space="preserve">↑ GAT1, ↓ GABA B receptor</w:t>
+              <w:t xml:space="preserve">
+                ↑ GAT1, ↓ GABA
+                <sub>B</sub>
+                 receptor
+              </w:t>
             </w:r>
           </w:p>
         </w:tc>
@@ -1363,7 +1423,11 @@
                 <w:rFonts w:ascii="Calibri" w:hAnsi="Calibri"/>
                 <w:sz w:val="20"/>
               </w:rPr>
-              <w:t xml:space="preserve">↑ GAT1, ↓ GABA B receptor</w:t>
+              <w:t xml:space="preserve">
+                ↑ GAT1, ↓ GABA
+                <sub>B</sub>
+                 receptor
+              </w:t>
             </w:r>
           </w:p>
         </w:tc>
@@ -1444,7 +1508,7 @@
                 <w:rFonts w:ascii="Calibri" w:hAnsi="Calibri"/>
                 <w:sz w:val="20"/>
               </w:rPr>
-              <w:t xml:space="preserve">↓ STX1A, ↑ STING1, ↓ GABRG2, ↑ SLC12A2, ↑ PRKCB, ↑ GSK3B, ↑ RNF34, ↑ CDK5, ↑ REST, ↑ GRK2, ↑ ARRB2, ↑ KCTD12, ↑ RGS4, ↑ RGS6</w:t>
+              <w:t xml:space="preserve">↑ STING1, ↓ GABRG2, ↑ RGS4</w:t>
             </w:r>
           </w:p>
         </w:tc>
@@ -1469,7 +1533,13 @@
                 <w:rFonts w:ascii="Calibri" w:hAnsi="Calibri"/>
                 <w:sz w:val="20"/>
               </w:rPr>
-              <w:t xml:space="preserve">↑ GAT1, ↓ GABA B receptor, ↓ GABA A receptor</w:t>
+              <w:t xml:space="preserve">
+                ↑ GAT1, ↓ GABA
+                <sub>B</sub>
+                 receptor, ↓ GABA
+                <sub>A</sub>
+                 receptor
+              </w:t>
             </w:r>
           </w:p>
         </w:tc>
@@ -1572,7 +1642,11 @@
                 <w:rFonts w:ascii="Calibri" w:hAnsi="Calibri"/>
                 <w:sz w:val="20"/>
               </w:rPr>
-              <w:t xml:space="preserve">↑ GAT1, ↓ GABA B receptor</w:t>
+              <w:t xml:space="preserve">
+                ↑ GAT1, ↓ GABA
+                <sub>B</sub>
+                 receptor
+              </w:t>
             </w:r>
           </w:p>
         </w:tc>
@@ -1678,7 +1752,13 @@
                 <w:rFonts w:ascii="Calibri" w:hAnsi="Calibri"/>
                 <w:sz w:val="20"/>
               </w:rPr>
-              <w:t xml:space="preserve">↑ GAT1, ↓ GABA B receptor, ↓ GABA A receptor</w:t>
+              <w:t xml:space="preserve">
+                ↑ GAT1, ↓ GABA
+                <sub>B</sub>
+                 receptor, ↓ GABA
+                <sub>A</sub>
+                 receptor
+              </w:t>
             </w:r>
           </w:p>
         </w:tc>
@@ -1757,31 +1837,37 @@
                 <w:rFonts w:ascii="Calibri" w:hAnsi="Calibri"/>
                 <w:sz w:val="20"/>
               </w:rPr>
-              <w:t xml:space="preserve">↓ STX1A, ↑ SLC6A1, ↑ SLC12A2, ↑ RNF34, ↑ CDK5, ↑ PRKCA, ↑ PRKCB, ↑ REST, ↑ GRK2</w:t>
-            </w:r>
-          </w:p>
-        </w:tc>
-        <w:tc>
-          <w:tcPr>
-            <w:tcBorders>
-              <w:top w:val="single" w:space="0" w:color="D3D3D3"/>
-              <w:bottom w:val="single" w:space="0" w:color="D3D3D3"/>
-              <w:start w:val="single" w:space="0" w:color="D3D3D3"/>
-              <w:end w:val="single" w:space="0" w:color="D3D3D3"/>
-            </w:tcBorders>
-          </w:tcPr>
-          <w:p>
-            <w:pPr>
-              <w:spacing w:before="0" w:after="60"/>
-              <w:keepNext/>
-              <w:jc w:val="center"/>
-            </w:pPr>
-            <w:r>
-              <w:rPr>
-                <w:rFonts w:ascii="Calibri" w:hAnsi="Calibri"/>
-                <w:sz w:val="20"/>
-              </w:rPr>
-              <w:t xml:space="preserve">↑ GAT1, ↓ GABA B receptor, ↓ GABA A receptor</w:t>
+              <w:t xml:space="preserve">↑ SLC6A1, ↑ PRKCA, ↑ GRK2</w:t>
+            </w:r>
+          </w:p>
+        </w:tc>
+        <w:tc>
+          <w:tcPr>
+            <w:tcBorders>
+              <w:top w:val="single" w:space="0" w:color="D3D3D3"/>
+              <w:bottom w:val="single" w:space="0" w:color="D3D3D3"/>
+              <w:start w:val="single" w:space="0" w:color="D3D3D3"/>
+              <w:end w:val="single" w:space="0" w:color="D3D3D3"/>
+            </w:tcBorders>
+          </w:tcPr>
+          <w:p>
+            <w:pPr>
+              <w:spacing w:before="0" w:after="60"/>
+              <w:keepNext/>
+              <w:jc w:val="center"/>
+            </w:pPr>
+            <w:r>
+              <w:rPr>
+                <w:rFonts w:ascii="Calibri" w:hAnsi="Calibri"/>
+                <w:sz w:val="20"/>
+              </w:rPr>
+              <w:t xml:space="preserve">
+                ↑ GAT1, ↓ GABA
+                <sub>B</sub>
+                 receptor, ↓ GABA
+                <sub>A</sub>
+                 receptor
+              </w:t>
             </w:r>
           </w:p>
         </w:tc>
@@ -1887,7 +1973,11 @@
                 <w:rFonts w:ascii="Calibri" w:hAnsi="Calibri"/>
                 <w:sz w:val="20"/>
               </w:rPr>
-              <w:t xml:space="preserve">↓ GABA B receptor</w:t>
+              <w:t xml:space="preserve">
+                ↓ GABA
+                <sub>B</sub>
+                 receptor
+              </w:t>
             </w:r>
           </w:p>
         </w:tc>
@@ -1990,7 +2080,11 @@
                 <w:rFonts w:ascii="Calibri" w:hAnsi="Calibri"/>
                 <w:sz w:val="20"/>
               </w:rPr>
-              <w:t xml:space="preserve">↓ GABA B receptor</w:t>
+              <w:t xml:space="preserve">
+                ↓ GABA
+                <sub>B</sub>
+                 receptor
+              </w:t>
             </w:r>
           </w:p>
         </w:tc>
@@ -2071,7 +2165,7 @@
                 <w:rFonts w:ascii="Calibri" w:hAnsi="Calibri"/>
                 <w:sz w:val="20"/>
               </w:rPr>
-              <w:t xml:space="preserve">↑ SLC12A2, ↑ RGS6, ↑ REST</w:t>
+              <w:t xml:space="preserve">↑ SLC12A2, ↑ REST</w:t>
             </w:r>
           </w:p>
         </w:tc>
@@ -2096,7 +2190,13 @@
                 <w:rFonts w:ascii="Calibri" w:hAnsi="Calibri"/>
                 <w:sz w:val="20"/>
               </w:rPr>
-              <w:t xml:space="preserve">↓ GABA B receptor, ↓ GABA A receptor</w:t>
+              <w:t xml:space="preserve">
+                ↓ GABA
+                <sub>B</sub>
+                 receptor, ↓ GABA
+                <sub>A</sub>
+                 receptor
+              </w:t>
             </w:r>
           </w:p>
         </w:tc>
@@ -2175,31 +2275,37 @@
                 <w:rFonts w:ascii="Calibri" w:hAnsi="Calibri"/>
                 <w:sz w:val="20"/>
               </w:rPr>
-              <w:t xml:space="preserve">↓ GABRG2, ↑ CDK5, ↑ GRK3, ↑ REST, ↑ RGS6</w:t>
-            </w:r>
-          </w:p>
-        </w:tc>
-        <w:tc>
-          <w:tcPr>
-            <w:tcBorders>
-              <w:top w:val="single" w:space="0" w:color="D3D3D3"/>
-              <w:bottom w:val="single" w:space="0" w:color="D3D3D3"/>
-              <w:start w:val="single" w:space="0" w:color="D3D3D3"/>
-              <w:end w:val="single" w:space="0" w:color="D3D3D3"/>
-            </w:tcBorders>
-          </w:tcPr>
-          <w:p>
-            <w:pPr>
-              <w:spacing w:before="0" w:after="60"/>
-              <w:keepNext/>
-              <w:jc w:val="center"/>
-            </w:pPr>
-            <w:r>
-              <w:rPr>
-                <w:rFonts w:ascii="Calibri" w:hAnsi="Calibri"/>
-                <w:sz w:val="20"/>
-              </w:rPr>
-              <w:t xml:space="preserve">↓ GABA B receptor, ↓ GABA A receptor</w:t>
+              <w:t xml:space="preserve">↓ GABRG2, ↑ GRK3</w:t>
+            </w:r>
+          </w:p>
+        </w:tc>
+        <w:tc>
+          <w:tcPr>
+            <w:tcBorders>
+              <w:top w:val="single" w:space="0" w:color="D3D3D3"/>
+              <w:bottom w:val="single" w:space="0" w:color="D3D3D3"/>
+              <w:start w:val="single" w:space="0" w:color="D3D3D3"/>
+              <w:end w:val="single" w:space="0" w:color="D3D3D3"/>
+            </w:tcBorders>
+          </w:tcPr>
+          <w:p>
+            <w:pPr>
+              <w:spacing w:before="0" w:after="60"/>
+              <w:keepNext/>
+              <w:jc w:val="center"/>
+            </w:pPr>
+            <w:r>
+              <w:rPr>
+                <w:rFonts w:ascii="Calibri" w:hAnsi="Calibri"/>
+                <w:sz w:val="20"/>
+              </w:rPr>
+              <w:t xml:space="preserve">
+                ↓ GABA
+                <sub>B</sub>
+                 receptor, ↓ GABA
+                <sub>A</sub>
+                 receptor
+              </w:t>
             </w:r>
           </w:p>
         </w:tc>
@@ -2280,7 +2386,7 @@
                 <w:rFonts w:ascii="Calibri" w:hAnsi="Calibri"/>
                 <w:sz w:val="20"/>
               </w:rPr>
-              <w:t xml:space="preserve">↓ GABRG2, ↑ SLC12A2, ↑ PRKCB, ↑ PRKCG, ↓ GABBR1, ↑ REST, ↑ GRK2, ↑ ARRB2, ↑ RGS6</w:t>
+              <w:t xml:space="preserve">↓ GABRG2, ↓ GABBR1</w:t>
             </w:r>
           </w:p>
         </w:tc>
@@ -2305,7 +2411,13 @@
                 <w:rFonts w:ascii="Calibri" w:hAnsi="Calibri"/>
                 <w:sz w:val="20"/>
               </w:rPr>
-              <w:t xml:space="preserve">↓ GABA B receptor, ↓ GABA A receptor</w:t>
+              <w:t xml:space="preserve">
+                ↓ GABA
+                <sub>B</sub>
+                 receptor, ↓ GABA
+                <sub>A</sub>
+                 receptor
+              </w:t>
             </w:r>
           </w:p>
         </w:tc>
@@ -2384,31 +2496,37 @@
                 <w:rFonts w:ascii="Calibri" w:hAnsi="Calibri"/>
                 <w:sz w:val="20"/>
               </w:rPr>
-              <w:t xml:space="preserve">↑ SLC12A2, ↑ PRKCB, ↑ RNF34, ↑ ARRB2</w:t>
-            </w:r>
-          </w:p>
-        </w:tc>
-        <w:tc>
-          <w:tcPr>
-            <w:tcBorders>
-              <w:top w:val="single" w:space="0" w:color="D3D3D3"/>
-              <w:bottom w:val="single" w:space="0" w:color="D3D3D3"/>
-              <w:start w:val="single" w:space="0" w:color="D3D3D3"/>
-              <w:end w:val="single" w:space="0" w:color="D3D3D3"/>
-            </w:tcBorders>
-          </w:tcPr>
-          <w:p>
-            <w:pPr>
-              <w:spacing w:before="0" w:after="60"/>
-              <w:keepNext/>
-              <w:jc w:val="center"/>
-            </w:pPr>
-            <w:r>
-              <w:rPr>
-                <w:rFonts w:ascii="Calibri" w:hAnsi="Calibri"/>
-                <w:sz w:val="20"/>
-              </w:rPr>
-              <w:t xml:space="preserve">↓ GABA B receptor, ↓ GABA A receptor</w:t>
+              <w:t xml:space="preserve">↑ RNF34, ↑ ARRB2</w:t>
+            </w:r>
+          </w:p>
+        </w:tc>
+        <w:tc>
+          <w:tcPr>
+            <w:tcBorders>
+              <w:top w:val="single" w:space="0" w:color="D3D3D3"/>
+              <w:bottom w:val="single" w:space="0" w:color="D3D3D3"/>
+              <w:start w:val="single" w:space="0" w:color="D3D3D3"/>
+              <w:end w:val="single" w:space="0" w:color="D3D3D3"/>
+            </w:tcBorders>
+          </w:tcPr>
+          <w:p>
+            <w:pPr>
+              <w:spacing w:before="0" w:after="60"/>
+              <w:keepNext/>
+              <w:jc w:val="center"/>
+            </w:pPr>
+            <w:r>
+              <w:rPr>
+                <w:rFonts w:ascii="Calibri" w:hAnsi="Calibri"/>
+                <w:sz w:val="20"/>
+              </w:rPr>
+              <w:t xml:space="preserve">
+                ↓ GABA
+                <sub>B</sub>
+                 receptor, ↓ GABA
+                <sub>A</sub>
+                 receptor
+              </w:t>
             </w:r>
           </w:p>
         </w:tc>
@@ -2489,7 +2607,7 @@
                 <w:rFonts w:ascii="Calibri" w:hAnsi="Calibri"/>
                 <w:sz w:val="20"/>
               </w:rPr>
-              <w:t xml:space="preserve">↑ SLC12A2, ↑ PRKCB, ↑ CDK5, ↓ GABBR1, ↑ REST, ↑ GRK2, ↑ ARRB2, ↑ RGS4, ↑ RGS6</w:t>
+              <w:t xml:space="preserve">↑ PRKCB, ↓ GABBR1</w:t>
             </w:r>
           </w:p>
         </w:tc>
@@ -2514,7 +2632,13 @@
                 <w:rFonts w:ascii="Calibri" w:hAnsi="Calibri"/>
                 <w:sz w:val="20"/>
               </w:rPr>
-              <w:t xml:space="preserve">↓ GABA B receptor, ↓ GABA A receptor</w:t>
+              <w:t xml:space="preserve">
+                ↓ GABA
+                <sub>B</sub>
+                 receptor, ↓ GABA
+                <sub>A</sub>
+                 receptor
+              </w:t>
             </w:r>
           </w:p>
         </w:tc>
@@ -2617,7 +2741,11 @@
                 <w:rFonts w:ascii="Calibri" w:hAnsi="Calibri"/>
                 <w:sz w:val="20"/>
               </w:rPr>
-              <w:t xml:space="preserve">↓ GABA A receptor</w:t>
+              <w:t xml:space="preserve">
+                ↓ GABA
+                <sub>A</sub>
+                 receptor
+              </w:t>
             </w:r>
           </w:p>
         </w:tc>
@@ -2723,7 +2851,11 @@
                 <w:rFonts w:ascii="Calibri" w:hAnsi="Calibri"/>
                 <w:sz w:val="20"/>
               </w:rPr>
-              <w:t xml:space="preserve">↓ GABA A receptor</w:t>
+              <w:t xml:space="preserve">
+                ↓ GABA
+                <sub>A</sub>
+                 receptor
+              </w:t>
             </w:r>
           </w:p>
         </w:tc>

</xml_diff>